<commit_message>
docs: audit design formulas diagrams and code contracts
</commit_message>
<xml_diff>
--- a/docs/world_model_design_20261022_01/基于世界模型的机器人抓取搬运系统设计与实现详细设计.docx
+++ b/docs/world_model_design_20261022_01/基于世界模型的机器人抓取搬运系统设计与实现详细设计.docx
@@ -36,7 +36,7 @@
         <w:jc w:val="both"/>
       </w:pPr>
       <w:r>
-        <w:t>本章围绕机器人罐体抓取搬运任务，设计由行为克隆（BC）策略、世界模型、延迟动作队列和失败恢复控制组成的闭环系统。世界模型学习当前状态与动作后果之间的关系，对候选动作的未来状态、任务进展和失持风险进行预测，为动作选择提供依据。系统基于robosuite和MuJoCo构建Panda机器人仿真环境[1-2]，采用低维状态输入完成抓取、搬运和放置。本章依次说明系统架构、功能模块、数据组织和模块接口。</w:t>
+        <w:t>本章面向机器人罐体抓取搬运任务，设计由行为克隆（Behavior Cloning，BC）策略、世界模型、延迟动作队列和失败恢复控制组成的闭环系统。世界模型学习状态与动作后果之间的关系，预测候选动作对应的未来状态、任务进展和失持风险，为动作选择提供依据。系统基于robosuite和MuJoCo构建Panda机器人仿真环境[1-2]，采用低维状态输入完成抓取、搬运和放置。本章依次说明系统架构、功能模块、数据组织和模块接口。</w:t>
       </w:r>
     </w:p>
     <w:p>
@@ -139,7 +139,7 @@
         <w:jc w:val="both"/>
       </w:pPr>
       <w:r>
-        <w:t>数据与仿真层采用HDF5保存示范和起点，NPZ保存同起点分支，PT保存模型检查点，JSON及JSONL保存配置和运行结果。仿真环境按20Hz执行七维动作，并向模型与控制层返回新观测。位置单位为米，姿态使用xyzw四元数，归一化动作范围为</w:t>
+        <w:t>数据与仿真层采用HDF5保存示范和起点，NPZ保存同起点分支，PT保存模型检查点，JSON及JSONL保存配置和运行结果。仿真环境以20 Hz执行七维动作，并向模型与控制层返回新观测。位置单位为米，姿态采用xyzw顺序的四元数，归一化动作范围为</w:t>
       </w:r>
       <m:oMath>
         <m:d>
@@ -173,7 +173,7 @@
         <w:jc w:val="both"/>
       </w:pPr>
       <w:r>
-        <w:t>离线阶段从示范构造状态与动作块训练行为克隆策略，再在真实延迟队列下采集同起点候选分支，训练世界模型的状态预测、任务读出和组内排序。模型部署时固定权重，复用训练阶段保存的标准化参数，不在任务执行过程中更新网络。</w:t>
+        <w:t>离线阶段由示范构造状态与动作块，训练行为克隆策略；再在两步动作延迟（D2）条件下采集同起点候选分支，训练世界模型的状态预测、任务读出和组内排序。部署时固定模型权重，并复用训练阶段的标准化参数，不在任务执行中更新网络。</w:t>
       </w:r>
     </w:p>
     <w:p>
@@ -207,7 +207,7 @@
         <w:jc w:val="both"/>
       </w:pPr>
       <w:r>
-        <w:t>状态构建模块把仿真器观测整理为23维向量，字段如表4-1所示。相对位姿描述物体与末端之间的抓取关系，绝对位姿描述物体所在区域和运输目标。两类信息同时存在时，需要保持坐标系、四元数顺序和时间对应关系一致。</w:t>
+        <w:t>状态构建模块将仿真器观测整理为23维向量，字段如表4-1所示。相对位姿描述物体与末端之间的抓取关系，绝对位姿描述二者在世界坐标系中的位置与姿态。目标位置来自固定任务几何，不属于23维模型输入；各状态字段须保持坐标系、四元数顺序与时间对应关系一致。</w:t>
       </w:r>
     </w:p>
     <w:p>
@@ -1390,7 +1390,7 @@
         <w:jc w:val="both"/>
       </w:pPr>
       <w:r>
-        <w:t>模型分别使用自身训练数据的均值和尺度标准化状态，尺度下界为0.02，并随检查点保存。开发集和在线观测复用这些统计量。新训练读取器只允许train和dev，主示范共200段，划分为140段训练、30段开发及30段封存测试；窗口不会跨示范边界拼接。</w:t>
+        <w:t>BC从训练窗口起点、世界模型从训练锚点计算状态均值与标准差，标准差下限为0.02，并随检查点保存。开发集和在线观测复用这些统计量。新训练读取器仅允许train和dev，200段示范划分为140段训练、30段开发及30段封存测试；训练窗口不跨轨迹边界。</w:t>
       </w:r>
     </w:p>
     <w:p>
@@ -1407,7 +1407,7 @@
         <w:jc w:val="both"/>
       </w:pPr>
       <w:r>
-        <w:t>行为克隆模块从当前23维状态生成8步七维动作块，为世界模型提供有限候选。网络采用三个宽度512的全连接隐层和5分量混合密度输出头，使用负对数似然训练。混合密度网络能够描述连续输出的多种模式[3]，减少仅回归平均动作带来的模式混合。</w:t>
+        <w:t>行为克隆模块从当前23维状态生成8步七维动作块，为世界模型提供有限候选。网络采用三个宽度为512的多层感知机（Multilayer Perceptron，MLP）隐层和5分量混合密度输出头，使用负对数似然训练。混合密度网络能够表达连续输出的多种模式[3]，用于描述示范中的多样动作。</w:t>
       </w:r>
     </w:p>
     <w:p>
@@ -1440,7 +1440,41 @@
         <w:jc w:val="both"/>
       </w:pPr>
       <w:r>
-        <w:t>输入为窗口起点状态，监督目标为该点之后8条示范动作。训练采用Adam，学习率0.0003、批量256、15,000次更新，保存开发集最优和固定末次检查点。检查点使用规则在闭环评价前确定；BC本身不判断恢复状态，也不依赖世界模型反向更新权重。</w:t>
+        <w:t>输入为时刻t的状态，监督目标为从该时刻开始的8条示范动作，即</w:t>
+      </w:r>
+      <m:oMath>
+        <m:sSub>
+          <m:e>
+            <m:r>
+              <m:t>a</m:t>
+            </m:r>
+          </m:e>
+          <m:sub>
+            <m:r>
+              <m:t>t</m:t>
+            </m:r>
+          </m:sub>
+        </m:sSub>
+      </m:oMath>
+      <w:r>
+        <w:t>至</w:t>
+      </w:r>
+      <m:oMath>
+        <m:sSub>
+          <m:e>
+            <m:r>
+              <m:t>a</m:t>
+            </m:r>
+          </m:e>
+          <m:sub>
+            <m:r>
+              <m:t>t+7</m:t>
+            </m:r>
+          </m:sub>
+        </m:sSub>
+      </m:oMath>
+      <w:r>
+        <w:t>。训练采用Adam，学习率为0.0003，批量为256，共更新15,000次。新入口保存best.pt与final.pt，冻结BC基线使用预先登记的policy_15000.pt，不依据闭环结果重新选点；其权重不通过世界模型更新。</w:t>
       </w:r>
     </w:p>
     <w:p>
@@ -1457,7 +1491,7 @@
         <w:jc w:val="both"/>
       </w:pPr>
       <w:r>
-        <w:t>世界模型以状态和动作序列为条件，预测动作造成的短期物理变化。这一设计采用学习环境动态为控制提供信息的思路[4]，具体实现为显式状态空间中的小型循环网络。输入状态为23维，动作维数为7，预测时域为8步，隐藏状态宽度为128。</w:t>
+        <w:t>世界模型以状态和动作序列为条件，预测动作造成的短期物理变化，采用学习环境动态为控制提供信息的思路[4]。网络以门控循环单元（Gated Recurrent Unit，GRU）为核心，输入状态为23维、动作为7维，预测时域为8步，隐藏状态宽度为128。</w:t>
       </w:r>
     </w:p>
     <w:p>
@@ -1465,7 +1499,7 @@
         <w:jc w:val="both"/>
       </w:pPr>
       <w:r>
-        <w:t>记标准化状态为</w:t>
+        <w:t>设模型均值、尺度为μ、s，标准化初始状态为</w:t>
       </w:r>
       <m:oMath>
         <m:sSub>
@@ -1476,10 +1510,28 @@
           </m:e>
           <m:sub>
             <m:r>
-              <m:t>j</m:t>
+              <m:t>0</m:t>
             </m:r>
           </m:sub>
         </m:sSub>
+        <m:r>
+          <m:t>=(</m:t>
+        </m:r>
+        <m:sSub>
+          <m:e>
+            <m:r>
+              <m:t>x</m:t>
+            </m:r>
+          </m:e>
+          <m:sub>
+            <m:r>
+              <m:t>0</m:t>
+            </m:r>
+          </m:sub>
+        </m:sSub>
+        <m:r>
+          <m:t>−μ)/s</m:t>
+        </m:r>
       </m:oMath>
       <w:r>
         <w:t>，隐藏状态为</w:t>
@@ -1499,7 +1551,7 @@
         </m:sSub>
       </m:oMath>
       <w:r>
-        <w:t>。初始隐藏状态由当前状态经过线性层和tanh得到，随后按动作逐步递推：</w:t>
+        <w:t>。初始隐藏状态由标准化初始状态经过线性层和tanh得到，随后按动作逐步递推：</w:t>
       </w:r>
     </w:p>
     <w:p>
@@ -1641,7 +1693,7 @@
         <w:jc w:val="both"/>
       </w:pPr>
       <w:r>
-        <w:t>GRU为门控循环单元，输入维数为23+7；残差网络</w:t>
+        <w:t>GRU输入维数为23+7，残差网络</w:t>
       </w:r>
       <m:oMath>
         <m:sSub>
@@ -1658,7 +1710,7 @@
         </m:sSub>
       </m:oMath>
       <w:r>
-        <w:t>采用128→128→23结构。系数0.1用于缩放状态残差，不代表控制周期。预测状态经尺度和均值变换返回物理量，并继续作为下一步输入，不在中间注入未来真值。</w:t>
+        <w:t>采用128→128→23结构。系数0.1用于缩放状态增量，不代表控制周期。模型保留标准化状态参与下一步递推，仅在返回预测状态时按s与μ反标准化，全过程不注入未来真实状态。</w:t>
       </w:r>
     </w:p>
     <w:p>
@@ -1719,7 +1771,7 @@
         <w:jc w:val="both"/>
       </w:pPr>
       <w:r>
-        <w:t>任务读出头采用23→128→2结构，分别输出进展与失持logits。正式Full使用future_only配置，读出只经过预测物理状态，不直接拼接隐藏状态；隐藏状态仍参与动态预测。网络总可训练参数为87,321。模型不对预测姿态施加刚体投影，因此未来状态可能偏离严格几何关系，输入端的canonical处理不能自动约束预测结果。</w:t>
+        <w:t>任务读出头采用23→128→2结构，分别输出进展与失持的未归一化分数（logits）。正式Full使用future_only配置，读出头输入为标准化预测状态z，不直接拼接隐藏状态；隐藏状态仍参与动态预测。网络总可训练参数为87,321。模型未对预测姿态施加刚体投影，未来状态可能偏离严格几何关系，输入端的canonical处理不能自动约束预测结果。</w:t>
       </w:r>
     </w:p>
     <w:p>
@@ -1858,7 +1910,7 @@
         </m:sSub>
       </m:oMath>
       <w:r>
-        <w:t>为标准化状态残差平方的均值，</w:t>
+        <w:t>为预测状态与真实状态之差除以尺度s后的平方均值，平均范围包括批次、候选、未来步和状态维度。</w:t>
       </w:r>
       <m:oMath>
         <m:sSub>
@@ -1898,7 +1950,7 @@
         </m:sSub>
       </m:oMath>
       <w:r>
-        <w:t>为带logits的二元交叉熵；排序项只比较同组真值评分差大于0.025的候选对，温度为0.1。组内排序用于区分动作相对优劣，状态预测用于约束动作后果的物理表示。</w:t>
+        <w:t>为带logits的二元交叉熵。排序项仅对同组i&lt;j且真实评分绝对差大于0.025的候选对，采用温度为0.1的成对逻辑损失并取均值；无有效配对时取零。</w:t>
       </w:r>
     </w:p>
     <w:p>
@@ -1906,7 +1958,15 @@
         <w:jc w:val="both"/>
       </w:pPr>
       <w:r>
-        <w:t>系统还保留Plain、DirectScore和prediction_only作为方法对照。prediction_only只训练状态预测、按开发状态误差选点，部署绕过未训练任务头并使用物理代价。正式恢复实验入口只装载冻结Full，不能把通用预测对照的评分规则混入正式配置。</w:t>
+        <w:t>正式Full采用Adam优化，学习率为0.0003，批量为16组（64条候选序列），共更新3,000次，梯度范数上限为10；每250步验证，按开发集平均后悔值最小选择检查点，并列时保留较早检查点。后悔值为组内最优真实评分与模型所选候选真实评分之差。固定模型种子为17、23和41。</w:t>
+      </w:r>
+    </w:p>
+    <w:p>
+      <w:pPr>
+        <w:jc w:val="both"/>
+      </w:pPr>
+      <w:r>
+        <w:t>系统保留Plain（不含排序损失）、DirectScore（直接评分）及prediction_only（仅状态预测）作为对照。prediction_only按开发集状态误差选择检查点，部署时使用物理代价，绕过未训练任务头。正式恢复评估仅装载冻结Full，与通用对照入口分别管理。</w:t>
       </w:r>
     </w:p>
     <w:p>
@@ -3016,7 +3076,7 @@
         <w:jc w:val="both"/>
       </w:pPr>
       <w:r>
-        <w:t>评分同时考虑末步进展、平均进展与峰值失持。先取最高分候选；如果它不是默认索引2，且相对索引2的分数提升小于0.02，则回退到索引2。关闭世界模型时也使用索引2，使对照保留相同BC及延迟补偿基线。读出是训练任务下的排序信号，不直接等同于经过校准的成功概率。</w:t>
+        <w:t>评分覆盖全部8步，包含公共前缀，同时考虑末步进展、平均进展与峰值失持。先取最高分候选；若其不是默认索引2，且相对索引2的提升小于0.02，则回退到索引2。关闭世界模型时也使用索引2，保持相同BC及延迟补偿基线。读出是排序信号，不等同于经过校准的成功概率。</w:t>
       </w:r>
     </w:p>
     <w:p>
@@ -3024,7 +3084,7 @@
         <w:jc w:val="both"/>
       </w:pPr>
       <w:r>
-        <w:t>D2执行队列初始为两条零动作。每步先把最终提交命令</w:t>
+        <w:t>D2执行采用先入先出（First In, First Out，FIFO）队列，初始为两条零动作。每步先将最终提交命令</w:t>
       </w:r>
       <m:oMath>
         <m:sSub>
@@ -3041,7 +3101,24 @@
         </m:sSub>
       </m:oMath>
       <w:r>
-        <w:t>加入尾部，再从头部取出动作，关系为：</w:t>
+        <w:t>加入尾部，再取出队首命令；记加噪前的出队命令为</w:t>
+      </w:r>
+      <m:oMath>
+        <m:sSub>
+          <m:e>
+            <m:r>
+              <m:t>a</m:t>
+            </m:r>
+          </m:e>
+          <m:sub>
+            <m:r>
+              <m:t>t</m:t>
+            </m:r>
+          </m:sub>
+        </m:sSub>
+      </m:oMath>
+      <w:r>
+        <w:t>，则：</w:t>
       </w:r>
     </w:p>
     <w:p>
@@ -3155,7 +3232,7 @@
         </m:sSub>
       </m:oMath>
       <w:r>
-        <w:t>在两个周期之后执行。出队动作的前三维按配置加入标准差0或0.05的高斯噪声，再限幅到</w:t>
+        <w:t>在两个周期之后执行。出队动作的前三维按配置加入标准差为0或0.05的高斯噪声，再将动作限幅到</w:t>
       </w:r>
       <m:oMath>
         <m:d>
@@ -3172,7 +3249,7 @@
         </m:d>
       </m:oMath>
       <w:r>
-        <w:t>，最后送入环境。20Hz下两周期名义延迟为0.10s；噪声0.05是归一化动作单位，不是位置测量误差。</w:t>
+        <w:t>并送入环境。在20 Hz下，两周期名义延迟为0.10 s；噪声以归一化动作量计，不表示位置测量误差。</w:t>
       </w:r>
     </w:p>
     <w:p>
@@ -3189,7 +3266,7 @@
         <w:jc w:val="both"/>
       </w:pPr>
       <w:r>
-        <w:t>恢复监督器位于候选建议与队列提交之间，只接收当前状态、建议动作、上一次实际执行动作及固定任务几何。它不接收世界模型评分、未来状态真值或环境成功标志。正常情况下透传候选建议，出现失持、长停滞或预算压力下的早期停滞时执行恢复。</w:t>
+        <w:t>恢复监督器位于候选建议与队列提交之间，接收当前状态、建议动作、上一次实际执行动作及固定任务几何，不接收世界模型评分或环境成功标志。正常时透传建议，依据失持、停滞或时间压力触发恢复。时间压力指剩余步数小于按距离与阶段驻留估算的所需步数，并受物体静置资格或稳定持物条件约束。</w:t>
       </w:r>
     </w:p>
     <w:p>
@@ -3197,7 +3274,7 @@
         <w:jc w:val="both"/>
       </w:pPr>
       <w:r>
-        <w:t>可观测抓持要求夹口处于0.025至0.067m、末端与物体距离小于0.09m、最近五帧世界系相对位置变化小于0.012m、物体抬升超过参考高度0.02m，并结合已执行闭爪命令或抓持锁存状态。连续丢失五帧且不属于主动释放时判为失持。五帧窗口用于抓持判断，不是任务成功判据。</w:t>
+        <w:t>处于NORMAL且回合累计控制步数达到80时，未持物、非主动释放、物体可达且未入目标区，可在65步无足够进展或达到第160步时触发恢复；时间压力下，距物体大于0.12 m，且25帧内距离改善小于0.008 m、抬升小于0.02 m时可提前触发。近物体或曾持物时另采用40帧、0.005 m进展阈值判断停滞；持物停滞可直接进入LIFT。</w:t>
       </w:r>
     </w:p>
     <w:p>
@@ -3205,7 +3282,15 @@
         <w:jc w:val="both"/>
       </w:pPr>
       <w:r>
-        <w:t>恢复流程包括回撤、对齐、下降、闭爪、试抬确认、抬升、搬运、放置、释放和退出。各阶段设置位置阈值、最小驻留和超时；例如CLOSE等待18步，TEST_LIFT在试抬后确认抓持，RELEASE等待16步。流程如图4-4所示。</w:t>
+        <w:t>可观测抓持要求夹口宽度严格处于0.025至0.067 m之间、末端与物体距离小于0.09 m、最近五帧相对位置与当前值之差均小于0.012 m，且物体抬升超过参考高度0.02 m，并结合已执行闭爪命令或抓持锁存状态。相对位置在世界坐标系中计算，参考高度通常为回合初始物体高度，试抬时改用进入CLOSE时的物体高度。曾确认抓持后连续五帧不满足判据，且不属于主动释放时，才判为失持。</w:t>
+      </w:r>
+    </w:p>
+    <w:p>
+      <w:pPr>
+        <w:jc w:val="both"/>
+      </w:pPr>
+      <w:r>
+        <w:t>恢复流程包括回撤、对齐、下降、闭爪、试抬确认、抬升、搬运、放置、释放和退出。各阶段按需组合位姿、抓持、驻留及超时条件；CLOSE等待18步，TEST_LIFT经至少7步且确认抓持后进入LIFT，35步仍未确认则请求重试；RELEASE等待16步。图4-4给出主流程及特殊转移。</w:t>
       </w:r>
     </w:p>
     <w:p>
@@ -3217,7 +3302,7 @@
       <w:r>
         <w:drawing>
           <wp:inline xmlns:a="http://schemas.openxmlformats.org/drawingml/2006/main" xmlns:pic="http://schemas.openxmlformats.org/drawingml/2006/picture">
-            <wp:extent cx="5652000" cy="2677263"/>
+            <wp:extent cx="5652000" cy="3227589"/>
             <wp:docPr id="4" name="Picture 4"/>
             <wp:cNvGraphicFramePr>
               <a:graphicFrameLocks noChangeAspect="1"/>
@@ -3238,7 +3323,7 @@
                   <pic:spPr>
                     <a:xfrm>
                       <a:off x="0" y="0"/>
-                      <a:ext cx="5652000" cy="2677263"/>
+                      <a:ext cx="5652000" cy="3227589"/>
                     </a:xfrm>
                     <a:prstGeom prst="rect"/>
                   </pic:spPr>
@@ -3266,7 +3351,7 @@
         <w:jc w:val="both"/>
       </w:pPr>
       <w:r>
-        <w:t>单回合最多两次恢复尝试，控制预算为400步；额度用尽或物体越出恢复区域后进入EXHAUSTED，停止恢复覆盖并透传策略建议。恢复器保留针对固定容器与夹爪的局部几何余量检查，但不代表机械臂全链条碰撞保证。现有队列预算扩展仍作为未采用候选保存，本章以冻结v5作为恢复实现。</w:t>
+        <w:t>单回合最多发起两次恢复尝试，第二次尝试可继续完成；再次请求重试时才进入EXHAUSTED。活动恢复中物体越界也直接进入该状态，随后停止覆盖并透传策略建议。恢复器检查固定容器与夹爪的局部几何余量，未保证机械臂全链条避碰。队列预算扩展仍为未采用候选，本章以冻结v5为恢复实现。</w:t>
       </w:r>
     </w:p>
     <w:p>
@@ -3283,7 +3368,7 @@
         <w:jc w:val="both"/>
       </w:pPr>
       <w:r>
-        <w:t>记录模块在每次控制时保存状态、BC块、候选评分、恢复诊断、队列和实际动作。基准在首次满足环境成功判据或400步时结束；环境成功只由评估器读取。成功回合额外执行20步稳定观察，单独存储，不增加基准控制步数或独立起点数。</w:t>
+        <w:t>记录模块逐步保存状态、BC动作块、候选评分、恢复诊断、队列与实际动作。基准在首次成功或达到400步时结束。成功要求罐体模型原点位于目标子区，高度介于箱底与其上方0.1 m之间，且末端与罐体间距离超过约0.0424 m，由评估器读取。成功后另执行20步张爪诊断，保留在途队列与噪声流；20步均满足成功且后10步最大速度小于0.02 m/s时记为稳定，不增加基准步数或独立起点数。</w:t>
       </w:r>
     </w:p>
     <w:p>
@@ -3378,7 +3463,7 @@
         <w:jc w:val="both"/>
       </w:pPr>
       <w:r>
-        <w:t>这些关系由文件元数据和程序校验维护，不依赖关系数据库。示范数据一般采用HDF5分组组织[5]，本项目沿用该方式保存连续数组；分支训练使用NPZ便于按候选组装载；模型权重及其配置共同写入PT。JSON负责结构化配置和汇总，JSONL按行保存较大的控制轨迹。</w:t>
+        <w:t>这些关系由文件元数据和程序校验维护。本项目以HDF5分组保存示范的观测与动作，便于按轨迹读取和划分，满足离线示范学习的数据组织需求[5]；分支训练使用NPZ按候选组装载，模型权重及配置共同写入PT。JSON保存配置与汇总，JSONL按行保存控制轨迹。</w:t>
       </w:r>
     </w:p>
     <w:p>
@@ -3850,7 +3935,7 @@
                 <w:b w:val="0"/>
                 <w:sz w:val="20"/>
               </w:rPr>
-              <w:t>文件路径与SHA</w:t>
+              <w:t>路径与SHA-256摘要</w:t>
             </w:r>
           </w:p>
         </w:tc>
@@ -4517,6 +4602,172 @@
                 <w:b w:val="0"/>
                 <w:sz w:val="20"/>
               </w:rPr>
+              <w:t>queue</w:t>
+            </w:r>
+          </w:p>
+        </w:tc>
+        <w:tc>
+          <w:tcPr>
+            <w:tcW w:type="dxa" w:w="3084"/>
+            <w:vAlign w:val="center"/>
+            <w:tcMar>
+              <w:top w:w="75" w:type="dxa"/>
+              <w:bottom w:w="75" w:type="dxa"/>
+              <w:left w:w="85" w:type="dxa"/>
+              <w:right w:w="85" w:type="dxa"/>
+            </w:tcMar>
+          </w:tcPr>
+          <w:p>
+            <w:pPr>
+              <w:spacing w:after="0" w:line="276" w:lineRule="auto"/>
+              <w:ind w:firstLine="0"/>
+              <w:jc w:val="center"/>
+            </w:pPr>
+            <w:r>
+              <w:rPr>
+                <w:b w:val="0"/>
+                <w:sz w:val="20"/>
+              </w:rPr>
+              <w:t>N×2×7</w:t>
+            </w:r>
+          </w:p>
+        </w:tc>
+        <w:tc>
+          <w:tcPr>
+            <w:tcW w:type="dxa" w:w="3810"/>
+            <w:vAlign w:val="center"/>
+            <w:tcMar>
+              <w:top w:w="75" w:type="dxa"/>
+              <w:bottom w:w="75" w:type="dxa"/>
+              <w:left w:w="85" w:type="dxa"/>
+              <w:right w:w="85" w:type="dxa"/>
+            </w:tcMar>
+          </w:tcPr>
+          <w:p>
+            <w:pPr>
+              <w:spacing w:after="0" w:line="276" w:lineRule="auto"/>
+              <w:ind w:firstLine="0"/>
+              <w:jc w:val="center"/>
+            </w:pPr>
+            <w:r>
+              <w:rPr>
+                <w:b w:val="0"/>
+                <w:sz w:val="20"/>
+              </w:rPr>
+              <w:t>锚点处在途命令</w:t>
+            </w:r>
+          </w:p>
+        </w:tc>
+      </w:tr>
+      <w:tr>
+        <w:trPr>
+          <w:cantSplit/>
+        </w:trPr>
+        <w:tc>
+          <w:tcPr>
+            <w:tcW w:type="dxa" w:w="2177"/>
+            <w:vAlign w:val="center"/>
+            <w:tcMar>
+              <w:top w:w="75" w:type="dxa"/>
+              <w:bottom w:w="75" w:type="dxa"/>
+              <w:left w:w="85" w:type="dxa"/>
+              <w:right w:w="85" w:type="dxa"/>
+            </w:tcMar>
+          </w:tcPr>
+          <w:p>
+            <w:pPr>
+              <w:spacing w:after="0" w:line="276" w:lineRule="auto"/>
+              <w:ind w:firstLine="0"/>
+              <w:jc w:val="center"/>
+            </w:pPr>
+            <w:r>
+              <w:rPr>
+                <w:b w:val="0"/>
+                <w:sz w:val="20"/>
+              </w:rPr>
+              <w:t>commands</w:t>
+            </w:r>
+          </w:p>
+        </w:tc>
+        <w:tc>
+          <w:tcPr>
+            <w:tcW w:type="dxa" w:w="3084"/>
+            <w:vAlign w:val="center"/>
+            <w:tcMar>
+              <w:top w:w="75" w:type="dxa"/>
+              <w:bottom w:w="75" w:type="dxa"/>
+              <w:left w:w="85" w:type="dxa"/>
+              <w:right w:w="85" w:type="dxa"/>
+            </w:tcMar>
+          </w:tcPr>
+          <w:p>
+            <w:pPr>
+              <w:spacing w:after="0" w:line="276" w:lineRule="auto"/>
+              <w:ind w:firstLine="0"/>
+              <w:jc w:val="center"/>
+            </w:pPr>
+            <w:r>
+              <w:rPr>
+                <w:b w:val="0"/>
+                <w:sz w:val="20"/>
+              </w:rPr>
+              <w:t>N×K×H×7</w:t>
+            </w:r>
+          </w:p>
+        </w:tc>
+        <w:tc>
+          <w:tcPr>
+            <w:tcW w:type="dxa" w:w="3810"/>
+            <w:vAlign w:val="center"/>
+            <w:tcMar>
+              <w:top w:w="75" w:type="dxa"/>
+              <w:bottom w:w="75" w:type="dxa"/>
+              <w:left w:w="85" w:type="dxa"/>
+              <w:right w:w="85" w:type="dxa"/>
+            </w:tcMar>
+          </w:tcPr>
+          <w:p>
+            <w:pPr>
+              <w:spacing w:after="0" w:line="276" w:lineRule="auto"/>
+              <w:ind w:firstLine="0"/>
+              <w:jc w:val="center"/>
+            </w:pPr>
+            <w:r>
+              <w:rPr>
+                <w:b w:val="0"/>
+                <w:sz w:val="20"/>
+              </w:rPr>
+              <w:t>每个候选的重复提交序列</w:t>
+            </w:r>
+          </w:p>
+        </w:tc>
+      </w:tr>
+      <w:tr>
+        <w:trPr>
+          <w:cantSplit/>
+        </w:trPr>
+        <w:tc>
+          <w:tcPr>
+            <w:tcW w:type="dxa" w:w="2177"/>
+            <w:vAlign w:val="center"/>
+            <w:tcMar>
+              <w:top w:w="75" w:type="dxa"/>
+              <w:bottom w:w="75" w:type="dxa"/>
+              <w:left w:w="85" w:type="dxa"/>
+              <w:right w:w="85" w:type="dxa"/>
+            </w:tcMar>
+          </w:tcPr>
+          <w:p>
+            <w:pPr>
+              <w:spacing w:after="0" w:line="276" w:lineRule="auto"/>
+              <w:ind w:firstLine="0"/>
+              <w:jc w:val="center"/>
+            </w:pPr>
+            <w:r>
+              <w:rPr>
+                <w:b w:val="0"/>
+                <w:sz w:val="20"/>
+              </w:rPr>
               <w:t>y</w:t>
             </w:r>
           </w:p>
@@ -4709,7 +4960,7 @@
                 <w:b w:val="0"/>
                 <w:sz w:val="20"/>
               </w:rPr>
-              <w:t>每组标识</w:t>
+              <w:t>N个字符串、N个整数</w:t>
             </w:r>
           </w:p>
         </w:tc>
@@ -4735,7 +4986,7 @@
                 <w:b w:val="0"/>
                 <w:sz w:val="20"/>
               </w:rPr>
-              <w:t>父轨迹与锚点来源</w:t>
+              <w:t>父轨迹及已执行前缀步数</w:t>
             </w:r>
           </w:p>
         </w:tc>
@@ -4792,7 +5043,7 @@
                 <w:b w:val="0"/>
                 <w:sz w:val="20"/>
               </w:rPr>
-              <w:t>标量字符串</w:t>
+              <w:t>可选标量字符串</w:t>
             </w:r>
           </w:p>
         </w:tc>
@@ -4818,7 +5069,7 @@
                 <w:b w:val="0"/>
                 <w:sz w:val="20"/>
               </w:rPr>
-              <w:t>legacy或canonical</w:t>
+              <w:t>新文件声明观测语义</w:t>
             </w:r>
           </w:p>
         </w:tc>
@@ -4835,7 +5086,7 @@
         <w:jc w:val="both"/>
       </w:pPr>
       <w:r>
-        <w:t>新canonical分支要求显式语义元数据，并核对几何一致性；历史缺省声明按legacy处理。parent在规范中为必需来源字段：现有入口在元数据存在时检查父轨迹隔离，缺少该字段时无法完成同等隔离检查，不应把缺失元数据的数据直接用于正式比较。</w:t>
+        <w:t>正式分支文件不含observation_semantics，加载时按legacy解释；新canonical分支须显式声明语义并核对几何一致性。point表示锚点之前已执行的控制步数，不是原示范帧索引。parent用于检查父轨迹隔离，缺失时无法完成同等检查，不应直接用于正式比较。</w:t>
       </w:r>
     </w:p>
     <w:p>
@@ -4843,7 +5094,7 @@
         <w:jc w:val="both"/>
       </w:pPr>
       <w:r>
-        <w:t>检查点的state_dict保存网络及标准化buffer，config保存dim、horizon、width、method、seed和观测语义等。加载时同时检查这些配置与运行任务，避免维度正确但语义、预测时域或读出方式错误。BC检查点另外保存mixtures和architecture，正式Full还要求future_only为真。</w:t>
+        <w:t>检查点的state_dict保存网络权重与标准化缓冲量。世界模型config包含dim、horizon、width、method及seed；BC配置包含dim、horizon、width及mixtures，未必含method。新BC配置记录architecture；历史检查点缺省为MLP，观测语义缺省为legacy。加载时核对任务契约，正式Full另要求future_only为真。</w:t>
       </w:r>
     </w:p>
     <w:p>
@@ -5583,7 +5834,7 @@
         <w:jc w:val="both"/>
       </w:pPr>
       <w:r>
-        <w:t>加噪前的出队命令另存executed_action_before_noise，以便重建噪声和限幅。compute_ms包括观测打包、BC、可选世界模型和恢复计算，不包括物理推进与文件写入。输出目录拒绝复用，阶段状态区分running、complete和failed；只有登记条件全部完成的阶段才进入正式统计。</w:t>
+        <w:t>加噪前的出队命令另存executed_action_before_noise。活动恢复诊断中，mode对应本步生成动作的阶段，next_mode为转移后的状态。compute_ms包含观测打包、BC、可选世界模型和恢复计算，不含物理推进与文件写入。输出目录拒绝复用，result.json.status区分单作业的running、complete和failed；批次通过完成回执与来源一致性检查后进入统计。</w:t>
       </w:r>
     </w:p>
     <w:p>
@@ -5609,7 +5860,7 @@
         <w:jc w:val="both"/>
       </w:pPr>
       <w:r>
-        <w:t>系统控制接口采用同一Python进程内的函数调用，传递NumPy数组或PyTorch张量。接口设计关注形状、单位、语义版本和返回值，而非为本地计算增加网络请求。主要接口如表4-6所示。</w:t>
+        <w:t>系统采用同一Python进程内的函数调用，传递NumPy数组或PyTorch张量。主要接口如表4-6所示，其中B为批量大小，K=4；输入单位和语义沿用前述状态与动作约定。</w:t>
       </w:r>
     </w:p>
     <w:p>
@@ -6029,7 +6280,7 @@
                 <w:b w:val="0"/>
                 <w:sz w:val="20"/>
               </w:rPr>
-              <w:t>状态与动作序列</w:t>
+              <w:t>B×23状态与B×8×7动作</w:t>
             </w:r>
           </w:p>
         </w:tc>
@@ -6048,14 +6299,14 @@
             <w:pPr>
               <w:spacing w:after="0" w:line="276" w:lineRule="auto"/>
               <w:ind w:firstLine="0"/>
-              <w:jc w:val="center"/>
+              <w:jc w:val="left"/>
             </w:pPr>
             <w:r>
               <w:rPr>
                 <w:b w:val="0"/>
                 <w:sz w:val="20"/>
               </w:rPr>
-              <w:t>未来状态与标签</w:t>
+              <w:t>B×8×23状态与B×8×2 logits</w:t>
             </w:r>
           </w:p>
         </w:tc>
@@ -6081,7 +6332,7 @@
                 <w:b w:val="0"/>
                 <w:sz w:val="20"/>
               </w:rPr>
-              <w:t>H=8 动作维数7</w:t>
+              <w:t>不返回标签概率</w:t>
             </w:r>
           </w:p>
         </w:tc>
@@ -6273,7 +6524,7 @@
                 <w:b w:val="0"/>
                 <w:sz w:val="20"/>
               </w:rPr>
-              <w:t>建议 索引 评分</w:t>
+              <w:t>建议 索引 评分或None</w:t>
             </w:r>
           </w:p>
         </w:tc>
@@ -6299,7 +6550,7 @@
                 <w:b w:val="0"/>
                 <w:sz w:val="20"/>
               </w:rPr>
-              <w:t>保留0.02回退阈值</w:t>
+              <w:t>0.02回退；无模型评分为空</w:t>
             </w:r>
           </w:p>
         </w:tc>
@@ -6330,7 +6581,7 @@
                 <w:b w:val="0"/>
                 <w:sz w:val="20"/>
               </w:rPr>
-              <w:t>supervisor.choose</w:t>
+              <w:t>RecoveryController.choose</w:t>
             </w:r>
           </w:p>
         </w:tc>
@@ -6425,7 +6676,7 @@
         <w:jc w:val="both"/>
       </w:pPr>
       <w:r>
-        <w:t>状态输入维数、动作时域和控制比例在启动时核对。当前OSC_POSE采用world参考系增量控制，平移每轴输出上限0.05m、旋转每轴上限0.5rad，接口思想参见官方控制器文档[6]，具体数值以本项目环境配置为准。归一化命令比例不能直接解释为接触状态下必然实现的末端位移。</w:t>
+        <w:t>启动时核对状态维数、动作时域和控制比例。操作空间位姿控制器（OSC_POSE）采用世界参考系增量控制，平移每轴输出上限为0.05 m、旋转每轴上限为0.5 rad，接口原理参见官方文档[6]，具体数值由环境配置确定。归一化命令与控制比例的乘积不等于接触状态下必然实现的末端位移。</w:t>
       </w:r>
     </w:p>
     <w:p>
@@ -6520,7 +6771,7 @@
         <w:jc w:val="both"/>
       </w:pPr>
       <w:r>
-        <w:t>运行前检查模型配置、观测语义、起点存在性、预算与队列长度。正式Full不接受canonical观测，不接受未登记模型种子；配置中的控制器延迟和上限必须与实际FIFO及循环预算一致。模型方法不支持所选读出时应拒绝启动，不能以未训练标签头填补缺失评分。</w:t>
+        <w:t>启动时检查模型配置、观测语义、起点存在性及控制预算，运行时构造两项FIFO并在Full候选展开时核对队列形状。正式Full仅接受legacy与已登记模型种子；控制器延迟和上限须与实际执行一致。模型方法不支持所选读出时拒绝启动，防止使用未训练标签头产生评分。</w:t>
       </w:r>
     </w:p>
     <w:p>
@@ -6528,7 +6779,7 @@
         <w:jc w:val="both"/>
       </w:pPr>
       <w:r>
-        <w:t>运行中发生异常时保留已有轨迹并尽力写入failed状态，环境在结束时释放。普通结果写入并非统一原子事务；遇到记录故障需保留原尝试，在新目录用相同冻结输入重跑并比较重合前缀。来源哈希和作业快照用于检测漂移，重复回放或重跑不增加独立样本数。</w:t>
+        <w:t>运行异常时保留已有轨迹并尝试写入failed状态，结束时释放仿真环境。结果文件分次写入；发生记录故障时保留原尝试，在新目录使用相同冻结输入重新执行，并比较重复前缀。来源哈希与作业快照用于检测文件变化，重复执行不增加独立样本数。</w:t>
       </w:r>
     </w:p>
     <w:p>

</xml_diff>

<commit_message>
docs: apply requested undergraduate thesis typography
</commit_message>
<xml_diff>
--- a/docs/world_model_design_20261022_01/基于世界模型的机器人抓取搬运系统设计与实现详细设计.docx
+++ b/docs/world_model_design_20261022_01/基于世界模型的机器人抓取搬运系统设计与实现详细设计.docx
@@ -6,6 +6,7 @@
       <w:pPr>
         <w:pStyle w:val="Title"/>
         <w:spacing w:before="0" w:after="80"/>
+        <w:ind w:firstLine="0" w:firstLineChars="0"/>
         <w:jc w:val="center"/>
       </w:pPr>
       <w:r>
@@ -15,7 +16,7 @@
     <w:p>
       <w:pPr>
         <w:spacing w:after="200"/>
-        <w:ind w:firstLine="0"/>
+        <w:ind w:firstLine="0" w:firstLineChars="0"/>
         <w:jc w:val="center"/>
       </w:pPr>
       <w:r>
@@ -25,6 +26,7 @@
     <w:p>
       <w:pPr>
         <w:pStyle w:val="Heading1"/>
+        <w:ind w:firstLineChars="0" w:firstLine="0"/>
         <w:jc w:val="center"/>
       </w:pPr>
       <w:r>
@@ -33,15 +35,43 @@
     </w:p>
     <w:p>
       <w:pPr>
+        <w:spacing w:line="360" w:lineRule="auto"/>
+        <w:ind w:firstLine="480" w:firstLineChars="200"/>
         <w:jc w:val="both"/>
       </w:pPr>
       <w:r>
-        <w:t>本章面向机器人罐体抓取搬运任务，设计由行为克隆（Behavior Cloning，BC）策略、世界模型、延迟动作队列和失败恢复控制组成的闭环系统。世界模型学习状态与动作后果之间的关系，预测候选动作对应的未来状态、任务进展和失持风险，为动作选择提供依据。系统基于robosuite和MuJoCo构建Panda机器人仿真环境[1-2]，采用低维状态输入完成抓取、搬运和放置。本章依次说明系统架构、功能模块、数据组织和模块接口。</w:t>
+        <w:rPr>
+          <w:rFonts w:ascii="Times New Roman" w:hAnsi="Times New Roman" w:eastAsia="宋体" w:cs="Times New Roman"/>
+          <w:b w:val="0"/>
+          <w:color w:val="000000"/>
+          <w:sz w:val="24"/>
+        </w:rPr>
+        <w:t xml:space="preserve">本章面向机器人罐体抓取搬运任务，设计由行为克隆（Behavior Cloning，BC）策略、世界模型、延迟动作队列和失败恢复控制组成的闭环系统。世界模型学习状态与动作后果之间的关系，预测候选动作对应的未来状态、任务进展和失持风险，为动作选择提供依据。系统基于robosuite和MuJoCo构建Panda机器人仿真环境</w:t>
+      </w:r>
+      <w:r>
+        <w:rPr>
+          <w:rFonts w:ascii="Times New Roman" w:hAnsi="Times New Roman" w:eastAsia="宋体" w:cs="Times New Roman"/>
+          <w:b w:val="0"/>
+          <w:color w:val="000000"/>
+          <w:sz w:val="24"/>
+          <w:vertAlign w:val="superscript"/>
+        </w:rPr>
+        <w:t xml:space="preserve">[1-2]</w:t>
+      </w:r>
+      <w:r>
+        <w:rPr>
+          <w:rFonts w:ascii="Times New Roman" w:hAnsi="Times New Roman" w:eastAsia="宋体" w:cs="Times New Roman"/>
+          <w:b w:val="0"/>
+          <w:color w:val="000000"/>
+          <w:sz w:val="24"/>
+        </w:rPr>
+        <w:t xml:space="preserve">，采用低维状态输入完成抓取、搬运和放置。本章依次说明系统架构、功能模块、数据组织和模块接口。</w:t>
       </w:r>
     </w:p>
     <w:p>
       <w:pPr>
         <w:pStyle w:val="Heading2"/>
+        <w:ind w:firstLineChars="0" w:firstLine="0"/>
         <w:jc w:val="left"/>
       </w:pPr>
       <w:r>
@@ -51,24 +81,33 @@
     <w:p>
       <w:pPr>
         <w:pStyle w:val="Heading3"/>
+        <w:ind w:firstLineChars="0" w:firstLine="0"/>
         <w:jc w:val="left"/>
       </w:pPr>
       <w:r>
-        <w:t>4.1.1 总体架构</w:t>
+        <w:t>4.1.1  总体架构</w:t>
       </w:r>
     </w:p>
     <w:p>
       <w:pPr>
+        <w:spacing w:line="360" w:lineRule="auto"/>
+        <w:ind w:firstLine="480" w:firstLineChars="200"/>
         <w:jc w:val="both"/>
       </w:pPr>
       <w:r>
+        <w:rPr>
+          <w:rFonts w:ascii="Times New Roman" w:hAnsi="Times New Roman" w:eastAsia="宋体" w:cs="Times New Roman"/>
+          <w:b w:val="0"/>
+          <w:color w:val="000000"/>
+          <w:sz w:val="24"/>
+        </w:rPr>
         <w:t>系统分为交互展示层、模型与控制层、数据与仿真层。交互展示层提供实验启动和结果浏览入口；模型与控制层承担动作生成、未来预测、候选评价及恢复控制；数据与仿真层保存示范、模型和执行记录，并推进机器人与物体的物理状态。各层通过文件配置、内存数组和Python函数传递数据，整体结构如图4-1所示。</w:t>
       </w:r>
     </w:p>
     <w:p>
       <w:pPr>
         <w:keepNext/>
-        <w:ind w:firstLine="0"/>
+        <w:ind w:firstLine="0" w:firstLineChars="0"/>
         <w:jc w:val="center"/>
       </w:pPr>
       <w:r>
@@ -111,7 +150,7 @@
         <w:pStyle w:val="Caption"/>
         <w:keepNext w:val="0"/>
         <w:spacing w:after="120" w:before="120"/>
-        <w:ind w:firstLine="0"/>
+        <w:ind w:firstLine="0" w:firstLineChars="0"/>
         <w:jc w:val="center"/>
       </w:pPr>
       <w:r>
@@ -120,25 +159,49 @@
     </w:p>
     <w:p>
       <w:pPr>
+        <w:spacing w:line="360" w:lineRule="auto"/>
+        <w:ind w:firstLine="480" w:firstLineChars="200"/>
         <w:jc w:val="both"/>
       </w:pPr>
       <w:r>
+        <w:rPr>
+          <w:rFonts w:ascii="Times New Roman" w:hAnsi="Times New Roman" w:eastAsia="宋体" w:cs="Times New Roman"/>
+          <w:b w:val="0"/>
+          <w:color w:val="000000"/>
+          <w:sz w:val="24"/>
+        </w:rPr>
         <w:t>交互展示层包括命令行运行入口和本地静态结果页面。实验人员指定策略、世界模型、扰动和恢复配置后启动任务，通过结果页面查看成功数、对照图和原始证据。页面读取已生成的结果文件，控制决策在Python评估进程内完成。</w:t>
       </w:r>
     </w:p>
     <w:p>
       <w:pPr>
+        <w:spacing w:line="360" w:lineRule="auto"/>
+        <w:ind w:firstLine="480" w:firstLineChars="200"/>
         <w:jc w:val="both"/>
       </w:pPr>
       <w:r>
+        <w:rPr>
+          <w:rFonts w:ascii="Times New Roman" w:hAnsi="Times New Roman" w:eastAsia="宋体" w:cs="Times New Roman"/>
+          <w:b w:val="0"/>
+          <w:color w:val="000000"/>
+          <w:sz w:val="24"/>
+        </w:rPr>
         <w:t>模型与控制层以世界模型动作评估为核心。行为克隆策略先生成动作块，世界模型结合当前状态和真实在途命令预测不同候选的后果，候选选择器输出建议动作。恢复监督器根据观测历史判断是否接管，随后把最终命令提交给动作队列。世界模型筛选与恢复控制分别承担动作比较和异常处置，具有独立开关。</w:t>
       </w:r>
     </w:p>
     <w:p>
       <w:pPr>
+        <w:spacing w:line="360" w:lineRule="auto"/>
+        <w:ind w:firstLine="480" w:firstLineChars="200"/>
         <w:jc w:val="both"/>
       </w:pPr>
       <w:r>
+        <w:rPr>
+          <w:rFonts w:ascii="Times New Roman" w:hAnsi="Times New Roman" w:eastAsia="宋体" w:cs="Times New Roman"/>
+          <w:b w:val="0"/>
+          <w:color w:val="000000"/>
+          <w:sz w:val="24"/>
+        </w:rPr>
         <w:t>数据与仿真层采用HDF5保存示范和起点，NPZ保存同起点分支，PT保存模型检查点，JSON及JSONL保存配置和运行结果。仿真环境以20 Hz执行七维动作，并向模型与控制层返回新观测。位置单位为米，姿态采用xyzw顺序的四元数，归一化动作范围为</w:t>
       </w:r>
       <m:oMath>
@@ -156,37 +219,61 @@
         </m:d>
       </m:oMath>
       <w:r>
+        <w:rPr>
+          <w:rFonts w:ascii="Times New Roman" w:hAnsi="Times New Roman" w:eastAsia="宋体" w:cs="Times New Roman"/>
+          <w:b w:val="0"/>
+          <w:color w:val="000000"/>
+          <w:sz w:val="24"/>
+        </w:rPr>
         <w:t>。</w:t>
       </w:r>
     </w:p>
     <w:p>
       <w:pPr>
         <w:pStyle w:val="Heading3"/>
+        <w:ind w:firstLineChars="0" w:firstLine="0"/>
         <w:jc w:val="left"/>
       </w:pPr>
       <w:r>
-        <w:t>4.1.2 离线训练与在线控制</w:t>
+        <w:t>4.1.2  离线训练与在线控制</w:t>
       </w:r>
     </w:p>
     <w:p>
       <w:pPr>
+        <w:spacing w:line="360" w:lineRule="auto"/>
+        <w:ind w:firstLine="480" w:firstLineChars="200"/>
         <w:jc w:val="both"/>
       </w:pPr>
       <w:r>
+        <w:rPr>
+          <w:rFonts w:ascii="Times New Roman" w:hAnsi="Times New Roman" w:eastAsia="宋体" w:cs="Times New Roman"/>
+          <w:b w:val="0"/>
+          <w:color w:val="000000"/>
+          <w:sz w:val="24"/>
+        </w:rPr>
         <w:t>离线阶段由示范构造状态与动作块，训练行为克隆策略；再在两步动作延迟（D2）条件下采集同起点候选分支，训练世界模型的状态预测、任务读出和组内排序。部署时固定模型权重，并复用训练阶段的标准化参数，不在任务执行中更新网络。</w:t>
       </w:r>
     </w:p>
     <w:p>
       <w:pPr>
+        <w:spacing w:line="360" w:lineRule="auto"/>
+        <w:ind w:firstLine="480" w:firstLineChars="200"/>
         <w:jc w:val="both"/>
       </w:pPr>
       <w:r>
+        <w:rPr>
+          <w:rFonts w:ascii="Times New Roman" w:hAnsi="Times New Roman" w:eastAsia="宋体" w:cs="Times New Roman"/>
+          <w:b w:val="0"/>
+          <w:color w:val="000000"/>
+          <w:sz w:val="24"/>
+        </w:rPr>
         <w:t>在线阶段每次接收观测后重新生成和评价候选，仅提交一条新命令。当前物理执行来自队列最旧项，环境推进后再次观测。该设计将有限时域预测嵌入逐步闭环，避免把整段预测动作直接当作实际执行结果。未来真实状态与奖励只在离线监督或事后评价中使用，不作为在线筛选的真值输入。</w:t>
       </w:r>
     </w:p>
     <w:p>
       <w:pPr>
         <w:pStyle w:val="Heading2"/>
+        <w:ind w:firstLineChars="0" w:firstLine="0"/>
         <w:jc w:val="left"/>
       </w:pPr>
       <w:r>
@@ -196,17 +283,26 @@
     <w:p>
       <w:pPr>
         <w:pStyle w:val="Heading3"/>
+        <w:ind w:firstLineChars="0" w:firstLine="0"/>
         <w:jc w:val="left"/>
       </w:pPr>
       <w:r>
-        <w:t>4.2.1 状态构建与预处理模块</w:t>
+        <w:t>4.2.1  状态构建与预处理模块</w:t>
       </w:r>
     </w:p>
     <w:p>
       <w:pPr>
+        <w:spacing w:line="360" w:lineRule="auto"/>
+        <w:ind w:firstLine="480" w:firstLineChars="200"/>
         <w:jc w:val="both"/>
       </w:pPr>
       <w:r>
+        <w:rPr>
+          <w:rFonts w:ascii="Times New Roman" w:hAnsi="Times New Roman" w:eastAsia="宋体" w:cs="Times New Roman"/>
+          <w:b w:val="0"/>
+          <w:color w:val="000000"/>
+          <w:sz w:val="24"/>
+        </w:rPr>
         <w:t>状态构建模块将仿真器观测整理为23维向量，字段如表4-1所示。相对位姿描述物体与末端之间的抓取关系，绝对位姿描述二者在世界坐标系中的位置与姿态。目标位置来自固定任务几何，不属于23维模型输入；各状态字段须保持坐标系、四元数顺序与时间对应关系一致。</w:t>
       </w:r>
     </w:p>
@@ -215,7 +311,7 @@
         <w:pStyle w:val="Caption"/>
         <w:keepNext/>
         <w:spacing w:after="120" w:before="120"/>
-        <w:ind w:firstLine="0"/>
+        <w:ind w:firstLine="0" w:firstLineChars="0"/>
         <w:jc w:val="center"/>
       </w:pPr>
       <w:r>
@@ -264,7 +360,7 @@
             <w:pPr>
               <w:keepNext/>
               <w:spacing w:after="0" w:line="276" w:lineRule="auto"/>
-              <w:ind w:firstLine="0"/>
+              <w:ind w:firstLine="0" w:firstLineChars="0"/>
               <w:jc w:val="center"/>
             </w:pPr>
             <w:r>
@@ -292,7 +388,7 @@
             <w:pPr>
               <w:keepNext/>
               <w:spacing w:after="0" w:line="276" w:lineRule="auto"/>
-              <w:ind w:firstLine="0"/>
+              <w:ind w:firstLine="0" w:firstLineChars="0"/>
               <w:jc w:val="center"/>
             </w:pPr>
             <w:r>
@@ -320,7 +416,7 @@
             <w:pPr>
               <w:keepNext/>
               <w:spacing w:after="0" w:line="276" w:lineRule="auto"/>
-              <w:ind w:firstLine="0"/>
+              <w:ind w:firstLine="0" w:firstLineChars="0"/>
               <w:jc w:val="center"/>
             </w:pPr>
             <w:r>
@@ -348,7 +444,7 @@
             <w:pPr>
               <w:keepNext/>
               <w:spacing w:after="0" w:line="276" w:lineRule="auto"/>
-              <w:ind w:firstLine="0"/>
+              <w:ind w:firstLine="0" w:firstLineChars="0"/>
               <w:jc w:val="center"/>
             </w:pPr>
             <w:r>
@@ -380,7 +476,7 @@
             <w:pPr>
               <w:keepNext/>
               <w:spacing w:after="0" w:line="276" w:lineRule="auto"/>
-              <w:ind w:firstLine="0"/>
+              <w:ind w:firstLine="0" w:firstLineChars="0"/>
               <w:jc w:val="center"/>
             </w:pPr>
             <w:r>
@@ -407,7 +503,7 @@
             <w:pPr>
               <w:keepNext/>
               <w:spacing w:after="0" w:line="276" w:lineRule="auto"/>
-              <w:ind w:firstLine="0"/>
+              <w:ind w:firstLine="0" w:firstLineChars="0"/>
               <w:jc w:val="center"/>
             </w:pPr>
             <w:r>
@@ -434,7 +530,7 @@
             <w:pPr>
               <w:keepNext/>
               <w:spacing w:after="0" w:line="276" w:lineRule="auto"/>
-              <w:ind w:firstLine="0"/>
+              <w:ind w:firstLine="0" w:firstLineChars="0"/>
               <w:jc w:val="center"/>
             </w:pPr>
             <w:r>
@@ -461,7 +557,7 @@
             <w:pPr>
               <w:keepNext/>
               <w:spacing w:after="0" w:line="276" w:lineRule="auto"/>
-              <w:ind w:firstLine="0"/>
+              <w:ind w:firstLine="0" w:firstLineChars="0"/>
               <w:jc w:val="center"/>
             </w:pPr>
             <w:r>
@@ -493,7 +589,7 @@
             <w:pPr>
               <w:keepNext/>
               <w:spacing w:after="0" w:line="276" w:lineRule="auto"/>
-              <w:ind w:firstLine="0"/>
+              <w:ind w:firstLine="0" w:firstLineChars="0"/>
               <w:jc w:val="center"/>
             </w:pPr>
             <w:r>
@@ -520,7 +616,7 @@
             <w:pPr>
               <w:keepNext/>
               <w:spacing w:after="0" w:line="276" w:lineRule="auto"/>
-              <w:ind w:firstLine="0"/>
+              <w:ind w:firstLine="0" w:firstLineChars="0"/>
               <w:jc w:val="center"/>
             </w:pPr>
             <w:r>
@@ -547,7 +643,7 @@
             <w:pPr>
               <w:keepNext/>
               <w:spacing w:after="0" w:line="276" w:lineRule="auto"/>
-              <w:ind w:firstLine="0"/>
+              <w:ind w:firstLine="0" w:firstLineChars="0"/>
               <w:jc w:val="center"/>
             </w:pPr>
             <w:r>
@@ -574,7 +670,7 @@
             <w:pPr>
               <w:keepNext/>
               <w:spacing w:after="0" w:line="276" w:lineRule="auto"/>
-              <w:ind w:firstLine="0"/>
+              <w:ind w:firstLine="0" w:firstLineChars="0"/>
               <w:jc w:val="center"/>
             </w:pPr>
             <w:r>
@@ -606,7 +702,7 @@
             <w:pPr>
               <w:keepNext/>
               <w:spacing w:after="0" w:line="276" w:lineRule="auto"/>
-              <w:ind w:firstLine="0"/>
+              <w:ind w:firstLine="0" w:firstLineChars="0"/>
               <w:jc w:val="center"/>
             </w:pPr>
             <w:r>
@@ -633,7 +729,7 @@
             <w:pPr>
               <w:keepNext/>
               <w:spacing w:after="0" w:line="276" w:lineRule="auto"/>
-              <w:ind w:firstLine="0"/>
+              <w:ind w:firstLine="0" w:firstLineChars="0"/>
               <w:jc w:val="center"/>
             </w:pPr>
             <w:r>
@@ -660,7 +756,7 @@
             <w:pPr>
               <w:keepNext/>
               <w:spacing w:after="0" w:line="276" w:lineRule="auto"/>
-              <w:ind w:firstLine="0"/>
+              <w:ind w:firstLine="0" w:firstLineChars="0"/>
               <w:jc w:val="center"/>
             </w:pPr>
             <w:r>
@@ -687,7 +783,7 @@
             <w:pPr>
               <w:keepNext/>
               <w:spacing w:after="0" w:line="276" w:lineRule="auto"/>
-              <w:ind w:firstLine="0"/>
+              <w:ind w:firstLine="0" w:firstLineChars="0"/>
               <w:jc w:val="center"/>
             </w:pPr>
             <w:r>
@@ -719,7 +815,7 @@
             <w:pPr>
               <w:keepNext/>
               <w:spacing w:after="0" w:line="276" w:lineRule="auto"/>
-              <w:ind w:firstLine="0"/>
+              <w:ind w:firstLine="0" w:firstLineChars="0"/>
               <w:jc w:val="center"/>
             </w:pPr>
             <w:r>
@@ -746,7 +842,7 @@
             <w:pPr>
               <w:keepNext/>
               <w:spacing w:after="0" w:line="276" w:lineRule="auto"/>
-              <w:ind w:firstLine="0"/>
+              <w:ind w:firstLine="0" w:firstLineChars="0"/>
               <w:jc w:val="center"/>
             </w:pPr>
             <w:r>
@@ -773,7 +869,7 @@
             <w:pPr>
               <w:keepNext/>
               <w:spacing w:after="0" w:line="276" w:lineRule="auto"/>
-              <w:ind w:firstLine="0"/>
+              <w:ind w:firstLine="0" w:firstLineChars="0"/>
               <w:jc w:val="center"/>
             </w:pPr>
             <w:r>
@@ -800,7 +896,7 @@
             <w:pPr>
               <w:keepNext/>
               <w:spacing w:after="0" w:line="276" w:lineRule="auto"/>
-              <w:ind w:firstLine="0"/>
+              <w:ind w:firstLine="0" w:firstLineChars="0"/>
               <w:jc w:val="center"/>
             </w:pPr>
             <w:r>
@@ -832,7 +928,7 @@
             <w:pPr>
               <w:keepNext/>
               <w:spacing w:after="0" w:line="276" w:lineRule="auto"/>
-              <w:ind w:firstLine="0"/>
+              <w:ind w:firstLine="0" w:firstLineChars="0"/>
               <w:jc w:val="center"/>
             </w:pPr>
             <w:r>
@@ -859,7 +955,7 @@
             <w:pPr>
               <w:keepNext/>
               <w:spacing w:after="0" w:line="276" w:lineRule="auto"/>
-              <w:ind w:firstLine="0"/>
+              <w:ind w:firstLine="0" w:firstLineChars="0"/>
               <w:jc w:val="center"/>
             </w:pPr>
             <w:r>
@@ -886,7 +982,7 @@
             <w:pPr>
               <w:keepNext/>
               <w:spacing w:after="0" w:line="276" w:lineRule="auto"/>
-              <w:ind w:firstLine="0"/>
+              <w:ind w:firstLine="0" w:firstLineChars="0"/>
               <w:jc w:val="center"/>
             </w:pPr>
             <w:r>
@@ -913,7 +1009,7 @@
             <w:pPr>
               <w:keepNext/>
               <w:spacing w:after="0" w:line="276" w:lineRule="auto"/>
-              <w:ind w:firstLine="0"/>
+              <w:ind w:firstLine="0" w:firstLineChars="0"/>
               <w:jc w:val="center"/>
             </w:pPr>
             <w:r>
@@ -945,7 +1041,7 @@
             <w:pPr>
               <w:keepNext/>
               <w:spacing w:after="0" w:line="276" w:lineRule="auto"/>
-              <w:ind w:firstLine="0"/>
+              <w:ind w:firstLine="0" w:firstLineChars="0"/>
               <w:jc w:val="center"/>
             </w:pPr>
             <w:r>
@@ -972,7 +1068,7 @@
             <w:pPr>
               <w:keepNext/>
               <w:spacing w:after="0" w:line="276" w:lineRule="auto"/>
-              <w:ind w:firstLine="0"/>
+              <w:ind w:firstLine="0" w:firstLineChars="0"/>
               <w:jc w:val="center"/>
             </w:pPr>
             <w:r>
@@ -999,7 +1095,7 @@
             <w:pPr>
               <w:keepNext/>
               <w:spacing w:after="0" w:line="276" w:lineRule="auto"/>
-              <w:ind w:firstLine="0"/>
+              <w:ind w:firstLine="0" w:firstLineChars="0"/>
               <w:jc w:val="center"/>
             </w:pPr>
             <w:r>
@@ -1026,7 +1122,7 @@
             <w:pPr>
               <w:keepNext/>
               <w:spacing w:after="0" w:line="276" w:lineRule="auto"/>
-              <w:ind w:firstLine="0"/>
+              <w:ind w:firstLine="0" w:firstLineChars="0"/>
               <w:jc w:val="center"/>
             </w:pPr>
             <w:r>
@@ -1057,7 +1153,7 @@
           <w:p>
             <w:pPr>
               <w:spacing w:after="0" w:line="276" w:lineRule="auto"/>
-              <w:ind w:firstLine="0"/>
+              <w:ind w:firstLine="0" w:firstLineChars="0"/>
               <w:jc w:val="center"/>
             </w:pPr>
             <w:r>
@@ -1083,7 +1179,7 @@
           <w:p>
             <w:pPr>
               <w:spacing w:after="0" w:line="276" w:lineRule="auto"/>
-              <w:ind w:firstLine="0"/>
+              <w:ind w:firstLine="0" w:firstLineChars="0"/>
               <w:jc w:val="center"/>
             </w:pPr>
             <w:r>
@@ -1109,7 +1205,7 @@
           <w:p>
             <w:pPr>
               <w:spacing w:after="0" w:line="276" w:lineRule="auto"/>
-              <w:ind w:firstLine="0"/>
+              <w:ind w:firstLine="0" w:firstLineChars="0"/>
               <w:jc w:val="center"/>
             </w:pPr>
             <w:r>
@@ -1135,7 +1231,7 @@
           <w:p>
             <w:pPr>
               <w:spacing w:after="0" w:line="276" w:lineRule="auto"/>
-              <w:ind w:firstLine="0"/>
+              <w:ind w:firstLine="0" w:firstLineChars="0"/>
               <w:jc w:val="center"/>
             </w:pPr>
             <w:r>
@@ -1152,14 +1248,22 @@
     <w:p>
       <w:pPr>
         <w:spacing w:after="60" w:line="120" w:lineRule="auto"/>
-        <w:ind w:firstLine="0"/>
+        <w:ind w:firstLine="0" w:firstLineChars="0"/>
       </w:pPr>
     </w:p>
     <w:p>
       <w:pPr>
+        <w:spacing w:line="360" w:lineRule="auto"/>
+        <w:ind w:firstLine="480" w:firstLineChars="200"/>
         <w:jc w:val="both"/>
       </w:pPr>
       <w:r>
+        <w:rPr>
+          <w:rFonts w:ascii="Times New Roman" w:hAnsi="Times New Roman" w:eastAsia="宋体" w:cs="Times New Roman"/>
+          <w:b w:val="0"/>
+          <w:color w:val="000000"/>
+          <w:sz w:val="24"/>
+        </w:rPr>
         <w:t>系统保留legacy和canonical两种观测语义。legacy兼容旧数据及冻结模型；canonical从同一帧绝对位姿重算相对字段，避免缓存顺序导致相对与绝对观测错位。设末端、物体世界位姿为</w:t>
       </w:r>
       <m:oMath>
@@ -1199,6 +1303,12 @@
         </m:d>
       </m:oMath>
       <w:r>
+        <w:rPr>
+          <w:rFonts w:ascii="Times New Roman" w:hAnsi="Times New Roman" w:eastAsia="宋体" w:cs="Times New Roman"/>
+          <w:b w:val="0"/>
+          <w:color w:val="000000"/>
+          <w:sz w:val="24"/>
+        </w:rPr>
         <w:t>和</w:t>
       </w:r>
       <m:oMath>
@@ -1238,12 +1348,19 @@
         </m:d>
       </m:oMath>
       <w:r>
+        <w:rPr>
+          <w:rFonts w:ascii="Times New Roman" w:hAnsi="Times New Roman" w:eastAsia="宋体" w:cs="Times New Roman"/>
+          <w:b w:val="0"/>
+          <w:color w:val="000000"/>
+          <w:sz w:val="24"/>
+        </w:rPr>
         <w:t>，则：</w:t>
       </w:r>
     </w:p>
     <w:p>
       <w:pPr>
         <w:pStyle w:val="EquationDesign"/>
+        <w:ind w:firstLine="0" w:firstLineChars="0"/>
       </w:pPr>
       <w:r>
         <w:tab/>
@@ -1379,42 +1496,94 @@
     </w:p>
     <w:p>
       <w:pPr>
+        <w:spacing w:line="360" w:lineRule="auto"/>
+        <w:ind w:firstLine="480" w:firstLineChars="200"/>
         <w:jc w:val="both"/>
       </w:pPr>
       <w:r>
+        <w:rPr>
+          <w:rFonts w:ascii="Times New Roman" w:hAnsi="Times New Roman" w:eastAsia="宋体" w:cs="Times New Roman"/>
+          <w:b w:val="0"/>
+          <w:color w:val="000000"/>
+          <w:sz w:val="24"/>
+        </w:rPr>
         <w:t>其中R为四元数对应的旋转矩阵，⊗为四元数乘法。canonical检查输入维度、有限值和两个绝对四元数的有效范数，并规范相对四元数符号；legacy在线路径保留历史拼接行为。本文将联合学习状态预测、任务读出与排序的完整世界模型记为Full；当前正式Full仍使用legacy，不能只因维数相同就切换到canonical。</w:t>
       </w:r>
     </w:p>
     <w:p>
       <w:pPr>
+        <w:spacing w:line="360" w:lineRule="auto"/>
+        <w:ind w:firstLine="480" w:firstLineChars="200"/>
         <w:jc w:val="both"/>
       </w:pPr>
       <w:r>
+        <w:rPr>
+          <w:rFonts w:ascii="Times New Roman" w:hAnsi="Times New Roman" w:eastAsia="宋体" w:cs="Times New Roman"/>
+          <w:b w:val="0"/>
+          <w:color w:val="000000"/>
+          <w:sz w:val="24"/>
+        </w:rPr>
         <w:t>BC从训练窗口起点、世界模型从训练锚点计算状态均值与标准差，标准差下限为0.02，并随检查点保存。开发集和在线观测复用这些统计量。新训练读取器仅允许train和dev，200段示范划分为140段训练、30段开发及30段封存测试；训练窗口不跨轨迹边界。</w:t>
       </w:r>
     </w:p>
     <w:p>
       <w:pPr>
         <w:pStyle w:val="Heading3"/>
+        <w:ind w:firstLineChars="0" w:firstLine="0"/>
         <w:jc w:val="left"/>
       </w:pPr>
       <w:r>
-        <w:t>4.2.2 行为克隆动作生成模块</w:t>
+        <w:t>4.2.2  行为克隆动作生成模块</w:t>
       </w:r>
     </w:p>
     <w:p>
       <w:pPr>
+        <w:spacing w:line="360" w:lineRule="auto"/>
+        <w:ind w:firstLine="480" w:firstLineChars="200"/>
         <w:jc w:val="both"/>
       </w:pPr>
       <w:r>
-        <w:t>行为克隆模块从当前23维状态生成8步七维动作块，为世界模型提供有限候选。网络采用三个宽度为512的多层感知机（Multilayer Perceptron，MLP）隐层和5分量混合密度输出头，使用负对数似然训练。混合密度网络能够表达连续输出的多种模式[3]，用于描述示范中的多样动作。</w:t>
+        <w:rPr>
+          <w:rFonts w:ascii="Times New Roman" w:hAnsi="Times New Roman" w:eastAsia="宋体" w:cs="Times New Roman"/>
+          <w:b w:val="0"/>
+          <w:color w:val="000000"/>
+          <w:sz w:val="24"/>
+        </w:rPr>
+        <w:t xml:space="preserve">行为克隆模块从当前23维状态生成8步七维动作块，为世界模型提供有限候选。网络采用三个宽度为512的多层感知机（Multilayer Perceptron，MLP）隐层和5分量混合密度输出头，使用负对数似然训练。混合密度网络能够表达连续输出的多种模式</w:t>
+      </w:r>
+      <w:r>
+        <w:rPr>
+          <w:rFonts w:ascii="Times New Roman" w:hAnsi="Times New Roman" w:eastAsia="宋体" w:cs="Times New Roman"/>
+          <w:b w:val="0"/>
+          <w:color w:val="000000"/>
+          <w:sz w:val="24"/>
+          <w:vertAlign w:val="superscript"/>
+        </w:rPr>
+        <w:t xml:space="preserve">[3]</w:t>
+      </w:r>
+      <w:r>
+        <w:rPr>
+          <w:rFonts w:ascii="Times New Roman" w:hAnsi="Times New Roman" w:eastAsia="宋体" w:cs="Times New Roman"/>
+          <w:b w:val="0"/>
+          <w:color w:val="000000"/>
+          <w:sz w:val="24"/>
+        </w:rPr>
+        <w:t xml:space="preserve">，用于描述示范中的多样动作。</w:t>
       </w:r>
     </w:p>
     <w:p>
       <w:pPr>
+        <w:spacing w:line="360" w:lineRule="auto"/>
+        <w:ind w:firstLine="480" w:firstLineChars="200"/>
         <w:jc w:val="both"/>
       </w:pPr>
       <w:r>
+        <w:rPr>
+          <w:rFonts w:ascii="Times New Roman" w:hAnsi="Times New Roman" w:eastAsia="宋体" w:cs="Times New Roman"/>
+          <w:b w:val="0"/>
+          <w:color w:val="000000"/>
+          <w:sz w:val="24"/>
+        </w:rPr>
         <w:t>每个高斯分量覆盖完整动作块，输出混合权重、均值和对角标准差。均值经过tanh限于</w:t>
       </w:r>
       <m:oMath>
@@ -1432,14 +1601,28 @@
         </m:d>
       </m:oMath>
       <w:r>
+        <w:rPr>
+          <w:rFonts w:ascii="Times New Roman" w:hAnsi="Times New Roman" w:eastAsia="宋体" w:cs="Times New Roman"/>
+          <w:b w:val="0"/>
+          <w:color w:val="000000"/>
+          <w:sz w:val="24"/>
+        </w:rPr>
         <w:t>，标准差经softplus后限制在[0.02,1]。部署时选择混合权重最大的分量均值，不随机采样。动作前三维为平移控制量，中间三维为旋转控制量，最后一维为夹爪控制量。</w:t>
       </w:r>
     </w:p>
     <w:p>
       <w:pPr>
+        <w:spacing w:line="360" w:lineRule="auto"/>
+        <w:ind w:firstLine="480" w:firstLineChars="200"/>
         <w:jc w:val="both"/>
       </w:pPr>
       <w:r>
+        <w:rPr>
+          <w:rFonts w:ascii="Times New Roman" w:hAnsi="Times New Roman" w:eastAsia="宋体" w:cs="Times New Roman"/>
+          <w:b w:val="0"/>
+          <w:color w:val="000000"/>
+          <w:sz w:val="24"/>
+        </w:rPr>
         <w:t>输入为时刻t的状态，监督目标为从该时刻开始的8条示范动作，即</w:t>
       </w:r>
       <m:oMath>
@@ -1457,6 +1640,12 @@
         </m:sSub>
       </m:oMath>
       <w:r>
+        <w:rPr>
+          <w:rFonts w:ascii="Times New Roman" w:hAnsi="Times New Roman" w:eastAsia="宋体" w:cs="Times New Roman"/>
+          <w:b w:val="0"/>
+          <w:color w:val="000000"/>
+          <w:sz w:val="24"/>
+        </w:rPr>
         <w:t>至</w:t>
       </w:r>
       <m:oMath>
@@ -1474,31 +1663,73 @@
         </m:sSub>
       </m:oMath>
       <w:r>
+        <w:rPr>
+          <w:rFonts w:ascii="Times New Roman" w:hAnsi="Times New Roman" w:eastAsia="宋体" w:cs="Times New Roman"/>
+          <w:b w:val="0"/>
+          <w:color w:val="000000"/>
+          <w:sz w:val="24"/>
+        </w:rPr>
         <w:t>。训练采用Adam，学习率为0.0003，批量为256，共更新15,000次。新入口保存best.pt与final.pt，冻结BC基线使用预先登记的policy_15000.pt，不依据闭环结果重新选点；其权重不通过世界模型更新。</w:t>
       </w:r>
     </w:p>
     <w:p>
       <w:pPr>
         <w:pStyle w:val="Heading3"/>
+        <w:ind w:firstLineChars="0" w:firstLine="0"/>
         <w:jc w:val="left"/>
       </w:pPr>
       <w:r>
-        <w:t>4.2.3 世界模型预测与学习模块</w:t>
+        <w:t>4.2.3  世界模型预测与学习模块</w:t>
       </w:r>
     </w:p>
     <w:p>
       <w:pPr>
+        <w:spacing w:line="360" w:lineRule="auto"/>
+        <w:ind w:firstLine="480" w:firstLineChars="200"/>
         <w:jc w:val="both"/>
       </w:pPr>
       <w:r>
-        <w:t>世界模型以状态和动作序列为条件，预测动作造成的短期物理变化，采用学习环境动态为控制提供信息的思路[4]。网络以门控循环单元（Gated Recurrent Unit，GRU）为核心，输入状态为23维、动作为7维，预测时域为8步，隐藏状态宽度为128。</w:t>
+        <w:rPr>
+          <w:rFonts w:ascii="Times New Roman" w:hAnsi="Times New Roman" w:eastAsia="宋体" w:cs="Times New Roman"/>
+          <w:b w:val="0"/>
+          <w:color w:val="000000"/>
+          <w:sz w:val="24"/>
+        </w:rPr>
+        <w:t xml:space="preserve">世界模型以状态和动作序列为条件，预测动作造成的短期物理变化，采用学习环境动态为控制提供信息的思路</w:t>
+      </w:r>
+      <w:r>
+        <w:rPr>
+          <w:rFonts w:ascii="Times New Roman" w:hAnsi="Times New Roman" w:eastAsia="宋体" w:cs="Times New Roman"/>
+          <w:b w:val="0"/>
+          <w:color w:val="000000"/>
+          <w:sz w:val="24"/>
+          <w:vertAlign w:val="superscript"/>
+        </w:rPr>
+        <w:t xml:space="preserve">[4]</w:t>
+      </w:r>
+      <w:r>
+        <w:rPr>
+          <w:rFonts w:ascii="Times New Roman" w:hAnsi="Times New Roman" w:eastAsia="宋体" w:cs="Times New Roman"/>
+          <w:b w:val="0"/>
+          <w:color w:val="000000"/>
+          <w:sz w:val="24"/>
+        </w:rPr>
+        <w:t xml:space="preserve">。网络以门控循环单元（Gated Recurrent Unit，GRU）为核心，输入状态为23维、动作为7维，预测时域为8步，隐藏状态宽度为128。</w:t>
       </w:r>
     </w:p>
     <w:p>
       <w:pPr>
+        <w:spacing w:line="360" w:lineRule="auto"/>
+        <w:ind w:firstLine="480" w:firstLineChars="200"/>
         <w:jc w:val="both"/>
       </w:pPr>
       <w:r>
+        <w:rPr>
+          <w:rFonts w:ascii="Times New Roman" w:hAnsi="Times New Roman" w:eastAsia="宋体" w:cs="Times New Roman"/>
+          <w:b w:val="0"/>
+          <w:color w:val="000000"/>
+          <w:sz w:val="24"/>
+        </w:rPr>
         <w:t>设模型均值、尺度为μ、s，标准化初始状态为</w:t>
       </w:r>
       <m:oMath>
@@ -1534,6 +1765,12 @@
         </m:r>
       </m:oMath>
       <w:r>
+        <w:rPr>
+          <w:rFonts w:ascii="Times New Roman" w:hAnsi="Times New Roman" w:eastAsia="宋体" w:cs="Times New Roman"/>
+          <w:b w:val="0"/>
+          <w:color w:val="000000"/>
+          <w:sz w:val="24"/>
+        </w:rPr>
         <w:t>，隐藏状态为</w:t>
       </w:r>
       <m:oMath>
@@ -1551,12 +1788,19 @@
         </m:sSub>
       </m:oMath>
       <w:r>
+        <w:rPr>
+          <w:rFonts w:ascii="Times New Roman" w:hAnsi="Times New Roman" w:eastAsia="宋体" w:cs="Times New Roman"/>
+          <w:b w:val="0"/>
+          <w:color w:val="000000"/>
+          <w:sz w:val="24"/>
+        </w:rPr>
         <w:t>。初始隐藏状态由标准化初始状态经过线性层和tanh得到，随后按动作逐步递推：</w:t>
       </w:r>
     </w:p>
     <w:p>
       <w:pPr>
         <w:pStyle w:val="EquationDesign"/>
+        <w:ind w:firstLine="0" w:firstLineChars="0"/>
       </w:pPr>
       <w:r>
         <w:tab/>
@@ -1690,9 +1934,17 @@
     </w:p>
     <w:p>
       <w:pPr>
+        <w:spacing w:line="360" w:lineRule="auto"/>
+        <w:ind w:firstLine="480" w:firstLineChars="200"/>
         <w:jc w:val="both"/>
       </w:pPr>
       <w:r>
+        <w:rPr>
+          <w:rFonts w:ascii="Times New Roman" w:hAnsi="Times New Roman" w:eastAsia="宋体" w:cs="Times New Roman"/>
+          <w:b w:val="0"/>
+          <w:color w:val="000000"/>
+          <w:sz w:val="24"/>
+        </w:rPr>
         <w:t>GRU输入维数为23+7，残差网络</w:t>
       </w:r>
       <m:oMath>
@@ -1710,13 +1962,19 @@
         </m:sSub>
       </m:oMath>
       <w:r>
+        <w:rPr>
+          <w:rFonts w:ascii="Times New Roman" w:hAnsi="Times New Roman" w:eastAsia="宋体" w:cs="Times New Roman"/>
+          <w:b w:val="0"/>
+          <w:color w:val="000000"/>
+          <w:sz w:val="24"/>
+        </w:rPr>
         <w:t>采用128→128→23结构。系数0.1用于缩放状态增量，不代表控制周期。模型保留标准化状态参与下一步递推，仅在返回预测状态时按s与μ反标准化，全过程不注入未来真实状态。</w:t>
       </w:r>
     </w:p>
     <w:p>
       <w:pPr>
         <w:keepNext/>
-        <w:ind w:firstLine="0"/>
+        <w:ind w:firstLine="0" w:firstLineChars="0"/>
         <w:jc w:val="center"/>
       </w:pPr>
       <w:r>
@@ -1759,7 +2017,7 @@
         <w:pStyle w:val="Caption"/>
         <w:keepNext w:val="0"/>
         <w:spacing w:after="120" w:before="120"/>
-        <w:ind w:firstLine="0"/>
+        <w:ind w:firstLine="0" w:firstLineChars="0"/>
         <w:jc w:val="center"/>
       </w:pPr>
       <w:r>
@@ -1768,31 +2026,56 @@
     </w:p>
     <w:p>
       <w:pPr>
+        <w:spacing w:line="360" w:lineRule="auto"/>
+        <w:ind w:firstLine="480" w:firstLineChars="200"/>
         <w:jc w:val="both"/>
       </w:pPr>
       <w:r>
+        <w:rPr>
+          <w:rFonts w:ascii="Times New Roman" w:hAnsi="Times New Roman" w:eastAsia="宋体" w:cs="Times New Roman"/>
+          <w:b w:val="0"/>
+          <w:color w:val="000000"/>
+          <w:sz w:val="24"/>
+        </w:rPr>
         <w:t>任务读出头采用23→128→2结构，分别输出进展与失持的未归一化分数（logits）。正式Full使用future_only配置，读出头输入为标准化预测状态z，不直接拼接隐藏状态；隐藏状态仍参与动态预测。网络总可训练参数为87,321。模型未对预测姿态施加刚体投影，未来状态可能偏离严格几何关系，输入端的canonical处理不能自动约束预测结果。</w:t>
       </w:r>
     </w:p>
     <w:p>
       <w:pPr>
+        <w:spacing w:line="360" w:lineRule="auto"/>
+        <w:ind w:firstLine="480" w:firstLineChars="200"/>
         <w:jc w:val="both"/>
       </w:pPr>
       <w:r>
+        <w:rPr>
+          <w:rFonts w:ascii="Times New Roman" w:hAnsi="Times New Roman" w:eastAsia="宋体" w:cs="Times New Roman"/>
+          <w:b w:val="0"/>
+          <w:color w:val="000000"/>
+          <w:sz w:val="24"/>
+        </w:rPr>
         <w:t>训练数据按同一物理锚点组织多个动作分支。采集时先重放真实执行历史恢复锚点及控制器状态，再保留相同在途队列展开四个候选。正式数据包含160组训练分支和64组开发分支，每组4个候选、8步未来，父轨迹在训练与开发之间隔离。各候选前两步应具有相同物理结果，用于核对公共延迟前缀。</w:t>
       </w:r>
     </w:p>
     <w:p>
       <w:pPr>
+        <w:spacing w:line="360" w:lineRule="auto"/>
+        <w:ind w:firstLine="480" w:firstLineChars="200"/>
         <w:jc w:val="both"/>
       </w:pPr>
       <w:r>
+        <w:rPr>
+          <w:rFonts w:ascii="Times New Roman" w:hAnsi="Times New Roman" w:eastAsia="宋体" w:cs="Times New Roman"/>
+          <w:b w:val="0"/>
+          <w:color w:val="000000"/>
+          <w:sz w:val="24"/>
+        </w:rPr>
         <w:t>进展标签在成功时取1，否则取阶段奖励最大值，属于连续软标签。初始抓取标记取决于锚点抓取阶段奖励是否大于0.3；仅当该标记为真、后续抓取奖励低于0.3且未成功时，失持标签取1，否则取0。该定义不同于恢复器的观测抓持判据。损失包括归一化状态误差、两类标签交叉熵与组内排序：</w:t>
       </w:r>
     </w:p>
     <w:p>
       <w:pPr>
         <w:pStyle w:val="EquationDesign"/>
+        <w:ind w:firstLine="0" w:firstLineChars="0"/>
       </w:pPr>
       <w:r>
         <w:tab/>
@@ -1887,9 +2170,17 @@
     </w:p>
     <w:p>
       <w:pPr>
+        <w:spacing w:line="360" w:lineRule="auto"/>
+        <w:ind w:firstLine="480" w:firstLineChars="200"/>
         <w:jc w:val="both"/>
       </w:pPr>
       <w:r>
+        <w:rPr>
+          <w:rFonts w:ascii="Times New Roman" w:hAnsi="Times New Roman" w:eastAsia="宋体" w:cs="Times New Roman"/>
+          <w:b w:val="0"/>
+          <w:color w:val="000000"/>
+          <w:sz w:val="24"/>
+        </w:rPr>
         <w:t>其中</w:t>
       </w:r>
       <m:oMath>
@@ -1910,6 +2201,12 @@
         </m:sSub>
       </m:oMath>
       <w:r>
+        <w:rPr>
+          <w:rFonts w:ascii="Times New Roman" w:hAnsi="Times New Roman" w:eastAsia="宋体" w:cs="Times New Roman"/>
+          <w:b w:val="0"/>
+          <w:color w:val="000000"/>
+          <w:sz w:val="24"/>
+        </w:rPr>
         <w:t>为预测状态与真实状态之差除以尺度s后的平方均值，平均范围包括批次、候选、未来步和状态维度。</w:t>
       </w:r>
       <m:oMath>
@@ -1930,6 +2227,12 @@
         </m:sSub>
       </m:oMath>
       <w:r>
+        <w:rPr>
+          <w:rFonts w:ascii="Times New Roman" w:hAnsi="Times New Roman" w:eastAsia="宋体" w:cs="Times New Roman"/>
+          <w:b w:val="0"/>
+          <w:color w:val="000000"/>
+          <w:sz w:val="24"/>
+        </w:rPr>
         <w:t>和</w:t>
       </w:r>
       <m:oMath>
@@ -1950,22 +2253,44 @@
         </m:sSub>
       </m:oMath>
       <w:r>
+        <w:rPr>
+          <w:rFonts w:ascii="Times New Roman" w:hAnsi="Times New Roman" w:eastAsia="宋体" w:cs="Times New Roman"/>
+          <w:b w:val="0"/>
+          <w:color w:val="000000"/>
+          <w:sz w:val="24"/>
+        </w:rPr>
         <w:t>为带logits的二元交叉熵。排序项仅对同组i&lt;j且真实评分绝对差大于0.025的候选对，采用温度为0.1的成对逻辑损失并取均值；无有效配对时取零。</w:t>
       </w:r>
     </w:p>
     <w:p>
       <w:pPr>
+        <w:spacing w:line="360" w:lineRule="auto"/>
+        <w:ind w:firstLine="480" w:firstLineChars="200"/>
         <w:jc w:val="both"/>
       </w:pPr>
       <w:r>
+        <w:rPr>
+          <w:rFonts w:ascii="Times New Roman" w:hAnsi="Times New Roman" w:eastAsia="宋体" w:cs="Times New Roman"/>
+          <w:b w:val="0"/>
+          <w:color w:val="000000"/>
+          <w:sz w:val="24"/>
+        </w:rPr>
         <w:t>正式Full采用Adam优化，学习率为0.0003，批量为16组（64条候选序列），共更新3,000次，梯度范数上限为10；每250步验证，按开发集平均后悔值最小选择检查点，并列时保留较早检查点。后悔值为组内最优真实评分与模型所选候选真实评分之差。固定模型种子为17、23和41。</w:t>
       </w:r>
     </w:p>
     <w:p>
       <w:pPr>
+        <w:spacing w:line="360" w:lineRule="auto"/>
+        <w:ind w:firstLine="480" w:firstLineChars="200"/>
         <w:jc w:val="both"/>
       </w:pPr>
       <w:r>
+        <w:rPr>
+          <w:rFonts w:ascii="Times New Roman" w:hAnsi="Times New Roman" w:eastAsia="宋体" w:cs="Times New Roman"/>
+          <w:b w:val="0"/>
+          <w:color w:val="000000"/>
+          <w:sz w:val="24"/>
+        </w:rPr>
         <w:t>系统保留Plain（不含排序损失）、DirectScore（直接评分）及prediction_only（仅状态预测）作为对照。prediction_only按开发集状态误差选择检查点，部署时使用物理代价，绕过未训练任务头。正式恢复评估仅装载冻结Full，与通用对照入口分别管理。</w:t>
       </w:r>
     </w:p>
@@ -1974,7 +2299,7 @@
         <w:pStyle w:val="Caption"/>
         <w:keepNext/>
         <w:spacing w:after="120" w:before="120"/>
-        <w:ind w:firstLine="0"/>
+        <w:ind w:firstLine="0" w:firstLineChars="0"/>
         <w:jc w:val="center"/>
       </w:pPr>
       <w:r>
@@ -2021,7 +2346,7 @@
           <w:p>
             <w:pPr>
               <w:spacing w:after="0" w:line="276" w:lineRule="auto"/>
-              <w:ind w:firstLine="0"/>
+              <w:ind w:firstLine="0" w:firstLineChars="0"/>
               <w:jc w:val="center"/>
             </w:pPr>
             <w:r>
@@ -2048,7 +2373,7 @@
           <w:p>
             <w:pPr>
               <w:spacing w:after="0" w:line="276" w:lineRule="auto"/>
-              <w:ind w:firstLine="0"/>
+              <w:ind w:firstLine="0" w:firstLineChars="0"/>
               <w:jc w:val="center"/>
             </w:pPr>
             <w:r>
@@ -2075,7 +2400,7 @@
           <w:p>
             <w:pPr>
               <w:spacing w:after="0" w:line="276" w:lineRule="auto"/>
-              <w:ind w:firstLine="0"/>
+              <w:ind w:firstLine="0" w:firstLineChars="0"/>
               <w:jc w:val="center"/>
             </w:pPr>
             <w:r>
@@ -2106,7 +2431,7 @@
           <w:p>
             <w:pPr>
               <w:spacing w:after="0" w:line="276" w:lineRule="auto"/>
-              <w:ind w:firstLine="0"/>
+              <w:ind w:firstLine="0" w:firstLineChars="0"/>
               <w:jc w:val="center"/>
             </w:pPr>
             <w:r>
@@ -2132,7 +2457,7 @@
           <w:p>
             <w:pPr>
               <w:spacing w:after="0" w:line="276" w:lineRule="auto"/>
-              <w:ind w:firstLine="0"/>
+              <w:ind w:firstLine="0" w:firstLineChars="0"/>
               <w:jc w:val="center"/>
             </w:pPr>
             <w:r>
@@ -2158,7 +2483,7 @@
           <w:p>
             <w:pPr>
               <w:spacing w:after="0" w:line="276" w:lineRule="auto"/>
-              <w:ind w:firstLine="0"/>
+              <w:ind w:firstLine="0" w:firstLineChars="0"/>
               <w:jc w:val="center"/>
             </w:pPr>
             <w:r>
@@ -2189,7 +2514,7 @@
           <w:p>
             <w:pPr>
               <w:spacing w:after="0" w:line="276" w:lineRule="auto"/>
-              <w:ind w:firstLine="0"/>
+              <w:ind w:firstLine="0" w:firstLineChars="0"/>
               <w:jc w:val="center"/>
             </w:pPr>
             <w:r>
@@ -2215,7 +2540,7 @@
           <w:p>
             <w:pPr>
               <w:spacing w:after="0" w:line="276" w:lineRule="auto"/>
-              <w:ind w:firstLine="0"/>
+              <w:ind w:firstLine="0" w:firstLineChars="0"/>
               <w:jc w:val="center"/>
             </w:pPr>
             <w:r>
@@ -2241,7 +2566,7 @@
           <w:p>
             <w:pPr>
               <w:spacing w:after="0" w:line="276" w:lineRule="auto"/>
-              <w:ind w:firstLine="0"/>
+              <w:ind w:firstLine="0" w:firstLineChars="0"/>
               <w:jc w:val="center"/>
             </w:pPr>
             <w:r>
@@ -2272,7 +2597,7 @@
           <w:p>
             <w:pPr>
               <w:spacing w:after="0" w:line="276" w:lineRule="auto"/>
-              <w:ind w:firstLine="0"/>
+              <w:ind w:firstLine="0" w:firstLineChars="0"/>
               <w:jc w:val="center"/>
             </w:pPr>
             <w:r>
@@ -2298,7 +2623,7 @@
           <w:p>
             <w:pPr>
               <w:spacing w:after="0" w:line="276" w:lineRule="auto"/>
-              <w:ind w:firstLine="0"/>
+              <w:ind w:firstLine="0" w:firstLineChars="0"/>
               <w:jc w:val="center"/>
             </w:pPr>
             <w:r>
@@ -2324,7 +2649,7 @@
           <w:p>
             <w:pPr>
               <w:spacing w:after="0" w:line="276" w:lineRule="auto"/>
-              <w:ind w:firstLine="0"/>
+              <w:ind w:firstLine="0" w:firstLineChars="0"/>
               <w:jc w:val="center"/>
             </w:pPr>
             <w:r>
@@ -2355,7 +2680,7 @@
           <w:p>
             <w:pPr>
               <w:spacing w:after="0" w:line="276" w:lineRule="auto"/>
-              <w:ind w:firstLine="0"/>
+              <w:ind w:firstLine="0" w:firstLineChars="0"/>
               <w:jc w:val="center"/>
             </w:pPr>
             <w:r>
@@ -2381,7 +2706,7 @@
           <w:p>
             <w:pPr>
               <w:spacing w:after="0" w:line="276" w:lineRule="auto"/>
-              <w:ind w:firstLine="0"/>
+              <w:ind w:firstLine="0" w:firstLineChars="0"/>
               <w:jc w:val="center"/>
             </w:pPr>
             <w:r>
@@ -2407,7 +2732,7 @@
           <w:p>
             <w:pPr>
               <w:spacing w:after="0" w:line="276" w:lineRule="auto"/>
-              <w:ind w:firstLine="0"/>
+              <w:ind w:firstLine="0" w:firstLineChars="0"/>
               <w:jc w:val="center"/>
             </w:pPr>
             <w:r>
@@ -2438,7 +2763,7 @@
           <w:p>
             <w:pPr>
               <w:spacing w:after="0" w:line="276" w:lineRule="auto"/>
-              <w:ind w:firstLine="0"/>
+              <w:ind w:firstLine="0" w:firstLineChars="0"/>
               <w:jc w:val="center"/>
             </w:pPr>
             <w:r>
@@ -2464,7 +2789,7 @@
           <w:p>
             <w:pPr>
               <w:spacing w:after="0" w:line="276" w:lineRule="auto"/>
-              <w:ind w:firstLine="0"/>
+              <w:ind w:firstLine="0" w:firstLineChars="0"/>
               <w:jc w:val="center"/>
             </w:pPr>
             <w:r>
@@ -2490,7 +2815,7 @@
           <w:p>
             <w:pPr>
               <w:spacing w:after="0" w:line="276" w:lineRule="auto"/>
-              <w:ind w:firstLine="0"/>
+              <w:ind w:firstLine="0" w:firstLineChars="0"/>
               <w:jc w:val="center"/>
             </w:pPr>
             <w:r>
@@ -2521,7 +2846,7 @@
           <w:p>
             <w:pPr>
               <w:spacing w:after="0" w:line="276" w:lineRule="auto"/>
-              <w:ind w:firstLine="0"/>
+              <w:ind w:firstLine="0" w:firstLineChars="0"/>
               <w:jc w:val="center"/>
             </w:pPr>
             <w:r>
@@ -2547,7 +2872,7 @@
           <w:p>
             <w:pPr>
               <w:spacing w:after="0" w:line="276" w:lineRule="auto"/>
-              <w:ind w:firstLine="0"/>
+              <w:ind w:firstLine="0" w:firstLineChars="0"/>
               <w:jc w:val="center"/>
             </w:pPr>
             <w:r>
@@ -2573,7 +2898,7 @@
           <w:p>
             <w:pPr>
               <w:spacing w:after="0" w:line="276" w:lineRule="auto"/>
-              <w:ind w:firstLine="0"/>
+              <w:ind w:firstLine="0" w:firstLineChars="0"/>
               <w:jc w:val="center"/>
             </w:pPr>
             <w:r>
@@ -2590,23 +2915,32 @@
     <w:p>
       <w:pPr>
         <w:spacing w:after="60" w:line="120" w:lineRule="auto"/>
-        <w:ind w:firstLine="0"/>
+        <w:ind w:firstLine="0" w:firstLineChars="0"/>
       </w:pPr>
     </w:p>
     <w:p>
       <w:pPr>
         <w:pStyle w:val="Heading3"/>
+        <w:ind w:firstLineChars="0" w:firstLine="0"/>
         <w:jc w:val="left"/>
       </w:pPr>
       <w:r>
-        <w:t>4.2.4 候选动作评估与延迟执行模块</w:t>
+        <w:t>4.2.4  候选动作评估与延迟执行模块</w:t>
       </w:r>
     </w:p>
     <w:p>
       <w:pPr>
+        <w:spacing w:line="360" w:lineRule="auto"/>
+        <w:ind w:firstLine="480" w:firstLineChars="200"/>
         <w:jc w:val="both"/>
       </w:pPr>
       <w:r>
+        <w:rPr>
+          <w:rFonts w:ascii="Times New Roman" w:hAnsi="Times New Roman" w:eastAsia="宋体" w:cs="Times New Roman"/>
+          <w:b w:val="0"/>
+          <w:color w:val="000000"/>
+          <w:sz w:val="24"/>
+        </w:rPr>
         <w:t>候选评估模块从BC动作块取索引0、1、2、3的四条命令。对每条候选命令</w:t>
       </w:r>
       <m:oMath>
@@ -2624,6 +2958,12 @@
         </m:sSub>
       </m:oMath>
       <w:r>
+        <w:rPr>
+          <w:rFonts w:ascii="Times New Roman" w:hAnsi="Times New Roman" w:eastAsia="宋体" w:cs="Times New Roman"/>
+          <w:b w:val="0"/>
+          <w:color w:val="000000"/>
+          <w:sz w:val="24"/>
+        </w:rPr>
         <w:t>，模型输入序列由当前真实队列</w:t>
       </w:r>
       <m:oMath>
@@ -2684,12 +3024,19 @@
         </m:r>
       </m:oMath>
       <w:r>
+        <w:rPr>
+          <w:rFonts w:ascii="Times New Roman" w:hAnsi="Times New Roman" w:eastAsia="宋体" w:cs="Times New Roman"/>
+          <w:b w:val="0"/>
+          <w:color w:val="000000"/>
+          <w:sz w:val="24"/>
+        </w:rPr>
         <w:t>及重复候选组成：</w:t>
       </w:r>
     </w:p>
     <w:p>
       <w:pPr>
         <w:pStyle w:val="EquationDesign"/>
+        <w:ind w:firstLine="0" w:firstLineChars="0"/>
       </w:pPr>
       <w:r>
         <w:tab/>
@@ -2848,16 +3195,24 @@
     </w:p>
     <w:p>
       <w:pPr>
+        <w:spacing w:line="360" w:lineRule="auto"/>
+        <w:ind w:firstLine="480" w:firstLineChars="200"/>
         <w:jc w:val="both"/>
       </w:pPr>
       <w:r>
+        <w:rPr>
+          <w:rFonts w:ascii="Times New Roman" w:hAnsi="Times New Roman" w:eastAsia="宋体" w:cs="Times New Roman"/>
+          <w:b w:val="0"/>
+          <w:color w:val="000000"/>
+          <w:sz w:val="24"/>
+        </w:rPr>
         <w:t>前两步是已经提交且不能被本轮候选替换的动作，后六步反映候选持续执行的短时假设。该序列用于比较候选，在线实际只提交一条命令，下一周期重新预测。模型不预先知道之后的执行噪声，也不把预测轨迹当作真实轨迹保存。</w:t>
       </w:r>
     </w:p>
     <w:p>
       <w:pPr>
         <w:keepNext/>
-        <w:ind w:firstLine="0"/>
+        <w:ind w:firstLine="0" w:firstLineChars="0"/>
         <w:jc w:val="center"/>
       </w:pPr>
       <w:r>
@@ -2900,7 +3255,7 @@
         <w:pStyle w:val="Caption"/>
         <w:keepNext w:val="0"/>
         <w:spacing w:after="120" w:before="120"/>
-        <w:ind w:firstLine="0"/>
+        <w:ind w:firstLine="0" w:firstLineChars="0"/>
         <w:jc w:val="center"/>
       </w:pPr>
       <w:r>
@@ -2909,9 +3264,17 @@
     </w:p>
     <w:p>
       <w:pPr>
+        <w:spacing w:line="360" w:lineRule="auto"/>
+        <w:ind w:firstLine="480" w:firstLineChars="200"/>
         <w:jc w:val="both"/>
       </w:pPr>
       <w:r>
+        <w:rPr>
+          <w:rFonts w:ascii="Times New Roman" w:hAnsi="Times New Roman" w:eastAsia="宋体" w:cs="Times New Roman"/>
+          <w:b w:val="0"/>
+          <w:color w:val="000000"/>
+          <w:sz w:val="24"/>
+        </w:rPr>
         <w:t>预测logits经sigmoid得到进展</w:t>
       </w:r>
       <m:oMath>
@@ -2929,6 +3292,12 @@
         </m:sSub>
       </m:oMath>
       <w:r>
+        <w:rPr>
+          <w:rFonts w:ascii="Times New Roman" w:hAnsi="Times New Roman" w:eastAsia="宋体" w:cs="Times New Roman"/>
+          <w:b w:val="0"/>
+          <w:color w:val="000000"/>
+          <w:sz w:val="24"/>
+        </w:rPr>
         <w:t>和失持读出</w:t>
       </w:r>
       <m:oMath>
@@ -2946,12 +3315,19 @@
         </m:sSub>
       </m:oMath>
       <w:r>
+        <w:rPr>
+          <w:rFonts w:ascii="Times New Roman" w:hAnsi="Times New Roman" w:eastAsia="宋体" w:cs="Times New Roman"/>
+          <w:b w:val="0"/>
+          <w:color w:val="000000"/>
+          <w:sz w:val="24"/>
+        </w:rPr>
         <w:t>，候选分数定义为：</w:t>
       </w:r>
     </w:p>
     <w:p>
       <w:pPr>
         <w:pStyle w:val="EquationDesign"/>
+        <w:ind w:firstLine="0" w:firstLineChars="0"/>
       </w:pPr>
       <w:r>
         <w:tab/>
@@ -3073,17 +3449,33 @@
     </w:p>
     <w:p>
       <w:pPr>
+        <w:spacing w:line="360" w:lineRule="auto"/>
+        <w:ind w:firstLine="480" w:firstLineChars="200"/>
         <w:jc w:val="both"/>
       </w:pPr>
       <w:r>
+        <w:rPr>
+          <w:rFonts w:ascii="Times New Roman" w:hAnsi="Times New Roman" w:eastAsia="宋体" w:cs="Times New Roman"/>
+          <w:b w:val="0"/>
+          <w:color w:val="000000"/>
+          <w:sz w:val="24"/>
+        </w:rPr>
         <w:t>评分覆盖全部8步，包含公共前缀，同时考虑末步进展、平均进展与峰值失持。先取最高分候选；若其不是默认索引2，且相对索引2的提升小于0.02，则回退到索引2。关闭世界模型时也使用索引2，保持相同BC及延迟补偿基线。读出是排序信号，不等同于经过校准的成功概率。</w:t>
       </w:r>
     </w:p>
     <w:p>
       <w:pPr>
+        <w:spacing w:line="360" w:lineRule="auto"/>
+        <w:ind w:firstLine="480" w:firstLineChars="200"/>
         <w:jc w:val="both"/>
       </w:pPr>
       <w:r>
+        <w:rPr>
+          <w:rFonts w:ascii="Times New Roman" w:hAnsi="Times New Roman" w:eastAsia="宋体" w:cs="Times New Roman"/>
+          <w:b w:val="0"/>
+          <w:color w:val="000000"/>
+          <w:sz w:val="24"/>
+        </w:rPr>
         <w:t>D2执行采用先入先出（First In, First Out，FIFO）队列，初始为两条零动作。每步先将最终提交命令</w:t>
       </w:r>
       <m:oMath>
@@ -3101,6 +3493,12 @@
         </m:sSub>
       </m:oMath>
       <w:r>
+        <w:rPr>
+          <w:rFonts w:ascii="Times New Roman" w:hAnsi="Times New Roman" w:eastAsia="宋体" w:cs="Times New Roman"/>
+          <w:b w:val="0"/>
+          <w:color w:val="000000"/>
+          <w:sz w:val="24"/>
+        </w:rPr>
         <w:t>加入尾部，再取出队首命令；记加噪前的出队命令为</w:t>
       </w:r>
       <m:oMath>
@@ -3118,12 +3516,19 @@
         </m:sSub>
       </m:oMath>
       <w:r>
+        <w:rPr>
+          <w:rFonts w:ascii="Times New Roman" w:hAnsi="Times New Roman" w:eastAsia="宋体" w:cs="Times New Roman"/>
+          <w:b w:val="0"/>
+          <w:color w:val="000000"/>
+          <w:sz w:val="24"/>
+        </w:rPr>
         <w:t>，则：</w:t>
       </w:r>
     </w:p>
     <w:p>
       <w:pPr>
         <w:pStyle w:val="EquationDesign"/>
+        <w:ind w:firstLine="0" w:firstLineChars="0"/>
       </w:pPr>
       <w:r>
         <w:tab/>
@@ -3212,9 +3617,17 @@
     </w:p>
     <w:p>
       <w:pPr>
+        <w:spacing w:line="360" w:lineRule="auto"/>
+        <w:ind w:firstLine="480" w:firstLineChars="200"/>
         <w:jc w:val="both"/>
       </w:pPr>
       <w:r>
+        <w:rPr>
+          <w:rFonts w:ascii="Times New Roman" w:hAnsi="Times New Roman" w:eastAsia="宋体" w:cs="Times New Roman"/>
+          <w:b w:val="0"/>
+          <w:color w:val="000000"/>
+          <w:sz w:val="24"/>
+        </w:rPr>
         <w:t>因此</w:t>
       </w:r>
       <m:oMath>
@@ -3232,6 +3645,12 @@
         </m:sSub>
       </m:oMath>
       <w:r>
+        <w:rPr>
+          <w:rFonts w:ascii="Times New Roman" w:hAnsi="Times New Roman" w:eastAsia="宋体" w:cs="Times New Roman"/>
+          <w:b w:val="0"/>
+          <w:color w:val="000000"/>
+          <w:sz w:val="24"/>
+        </w:rPr>
         <w:t>在两个周期之后执行。出队动作的前三维按配置加入标准差为0或0.05的高斯噪声，再将动作限幅到</w:t>
       </w:r>
       <m:oMath>
@@ -3249,54 +3668,93 @@
         </m:d>
       </m:oMath>
       <w:r>
+        <w:rPr>
+          <w:rFonts w:ascii="Times New Roman" w:hAnsi="Times New Roman" w:eastAsia="宋体" w:cs="Times New Roman"/>
+          <w:b w:val="0"/>
+          <w:color w:val="000000"/>
+          <w:sz w:val="24"/>
+        </w:rPr>
         <w:t>并送入环境。在20 Hz下，两周期名义延迟为0.10 s；噪声以归一化动作量计，不表示位置测量误差。</w:t>
       </w:r>
     </w:p>
     <w:p>
       <w:pPr>
         <w:pStyle w:val="Heading3"/>
+        <w:ind w:firstLineChars="0" w:firstLine="0"/>
         <w:jc w:val="left"/>
       </w:pPr>
       <w:r>
-        <w:t>4.2.5 失败恢复监督模块</w:t>
+        <w:t>4.2.5  失败恢复监督模块</w:t>
       </w:r>
     </w:p>
     <w:p>
       <w:pPr>
+        <w:spacing w:line="360" w:lineRule="auto"/>
+        <w:ind w:firstLine="480" w:firstLineChars="200"/>
         <w:jc w:val="both"/>
       </w:pPr>
       <w:r>
+        <w:rPr>
+          <w:rFonts w:ascii="Times New Roman" w:hAnsi="Times New Roman" w:eastAsia="宋体" w:cs="Times New Roman"/>
+          <w:b w:val="0"/>
+          <w:color w:val="000000"/>
+          <w:sz w:val="24"/>
+        </w:rPr>
         <w:t>恢复监督器位于候选建议与队列提交之间，接收当前状态、建议动作、上一次实际执行动作及固定任务几何，不接收世界模型评分或环境成功标志。正常时透传建议，依据失持、停滞或时间压力触发恢复。时间压力指剩余步数小于按距离与阶段驻留估算的所需步数，并受物体静置资格或稳定持物条件约束。</w:t>
       </w:r>
     </w:p>
     <w:p>
       <w:pPr>
+        <w:spacing w:line="360" w:lineRule="auto"/>
+        <w:ind w:firstLine="480" w:firstLineChars="200"/>
         <w:jc w:val="both"/>
       </w:pPr>
       <w:r>
+        <w:rPr>
+          <w:rFonts w:ascii="Times New Roman" w:hAnsi="Times New Roman" w:eastAsia="宋体" w:cs="Times New Roman"/>
+          <w:b w:val="0"/>
+          <w:color w:val="000000"/>
+          <w:sz w:val="24"/>
+        </w:rPr>
         <w:t>处于NORMAL且回合累计控制步数达到80时，未持物、非主动释放、物体可达且未入目标区，可在65步无足够进展或达到第160步时触发恢复；时间压力下，距物体大于0.12 m，且25帧内距离改善小于0.008 m、抬升小于0.02 m时可提前触发。近物体或曾持物时另采用40帧、0.005 m进展阈值判断停滞；持物停滞可直接进入LIFT。</w:t>
       </w:r>
     </w:p>
     <w:p>
       <w:pPr>
+        <w:spacing w:line="360" w:lineRule="auto"/>
+        <w:ind w:firstLine="480" w:firstLineChars="200"/>
         <w:jc w:val="both"/>
       </w:pPr>
       <w:r>
+        <w:rPr>
+          <w:rFonts w:ascii="Times New Roman" w:hAnsi="Times New Roman" w:eastAsia="宋体" w:cs="Times New Roman"/>
+          <w:b w:val="0"/>
+          <w:color w:val="000000"/>
+          <w:sz w:val="24"/>
+        </w:rPr>
         <w:t>可观测抓持要求夹口宽度严格处于0.025至0.067 m之间、末端与物体距离小于0.09 m、最近五帧相对位置与当前值之差均小于0.012 m，且物体抬升超过参考高度0.02 m，并结合已执行闭爪命令或抓持锁存状态。相对位置在世界坐标系中计算，参考高度通常为回合初始物体高度，试抬时改用进入CLOSE时的物体高度。曾确认抓持后连续五帧不满足判据，且不属于主动释放时，才判为失持。</w:t>
       </w:r>
     </w:p>
     <w:p>
       <w:pPr>
+        <w:spacing w:line="360" w:lineRule="auto"/>
+        <w:ind w:firstLine="480" w:firstLineChars="200"/>
         <w:jc w:val="both"/>
       </w:pPr>
       <w:r>
+        <w:rPr>
+          <w:rFonts w:ascii="Times New Roman" w:hAnsi="Times New Roman" w:eastAsia="宋体" w:cs="Times New Roman"/>
+          <w:b w:val="0"/>
+          <w:color w:val="000000"/>
+          <w:sz w:val="24"/>
+        </w:rPr>
         <w:t>恢复流程包括回撤、对齐、下降、闭爪、试抬确认、抬升、搬运、放置、释放和退出。各阶段按需组合位姿、抓持、驻留及超时条件；CLOSE等待18步，TEST_LIFT经至少7步且确认抓持后进入LIFT，35步仍未确认则请求重试；RELEASE等待16步。图4-4给出主流程及特殊转移。</w:t>
       </w:r>
     </w:p>
     <w:p>
       <w:pPr>
         <w:keepNext/>
-        <w:ind w:firstLine="0"/>
+        <w:ind w:firstLine="0" w:firstLineChars="0"/>
         <w:jc w:val="center"/>
       </w:pPr>
       <w:r>
@@ -3339,7 +3797,7 @@
         <w:pStyle w:val="Caption"/>
         <w:keepNext w:val="0"/>
         <w:spacing w:after="120" w:before="120"/>
-        <w:ind w:firstLine="0"/>
+        <w:ind w:firstLine="0" w:firstLineChars="0"/>
         <w:jc w:val="center"/>
       </w:pPr>
       <w:r>
@@ -3348,40 +3806,66 @@
     </w:p>
     <w:p>
       <w:pPr>
+        <w:spacing w:line="360" w:lineRule="auto"/>
+        <w:ind w:firstLine="480" w:firstLineChars="200"/>
         <w:jc w:val="both"/>
       </w:pPr>
       <w:r>
+        <w:rPr>
+          <w:rFonts w:ascii="Times New Roman" w:hAnsi="Times New Roman" w:eastAsia="宋体" w:cs="Times New Roman"/>
+          <w:b w:val="0"/>
+          <w:color w:val="000000"/>
+          <w:sz w:val="24"/>
+        </w:rPr>
         <w:t>单回合最多发起两次恢复尝试，第二次尝试可继续完成；再次请求重试时才进入EXHAUSTED。活动恢复中物体越界也直接进入该状态，随后停止覆盖并透传策略建议。恢复器检查固定容器与夹爪的局部几何余量，未保证机械臂全链条避碰。队列预算扩展仍为未采用候选，本章以冻结v5为恢复实现。</w:t>
       </w:r>
     </w:p>
     <w:p>
       <w:pPr>
         <w:pStyle w:val="Heading3"/>
+        <w:ind w:firstLineChars="0" w:firstLine="0"/>
         <w:jc w:val="left"/>
       </w:pPr>
       <w:r>
-        <w:t>4.2.6 结果记录与展示模块</w:t>
+        <w:t>4.2.6  结果记录与展示模块</w:t>
       </w:r>
     </w:p>
     <w:p>
       <w:pPr>
+        <w:spacing w:line="360" w:lineRule="auto"/>
+        <w:ind w:firstLine="480" w:firstLineChars="200"/>
         <w:jc w:val="both"/>
       </w:pPr>
       <w:r>
+        <w:rPr>
+          <w:rFonts w:ascii="Times New Roman" w:hAnsi="Times New Roman" w:eastAsia="宋体" w:cs="Times New Roman"/>
+          <w:b w:val="0"/>
+          <w:color w:val="000000"/>
+          <w:sz w:val="24"/>
+        </w:rPr>
         <w:t>记录模块逐步保存状态、BC动作块、候选评分、恢复诊断、队列与实际动作。基准在首次成功或达到400步时结束。成功要求罐体模型原点位于目标子区，高度介于箱底与其上方0.1 m之间，且末端与罐体间距离超过约0.0424 m，由评估器读取。成功后另执行20步张爪诊断，保留在途队列与噪声流；20步均满足成功且后10步最大速度小于0.02 m/s时记为稳定，不增加基准步数或独立起点数。</w:t>
       </w:r>
     </w:p>
     <w:p>
       <w:pPr>
+        <w:spacing w:line="360" w:lineRule="auto"/>
+        <w:ind w:firstLine="480" w:firstLineChars="200"/>
         <w:jc w:val="both"/>
       </w:pPr>
       <w:r>
+        <w:rPr>
+          <w:rFonts w:ascii="Times New Roman" w:hAnsi="Times New Roman" w:eastAsia="宋体" w:cs="Times New Roman"/>
+          <w:b w:val="0"/>
+          <w:color w:val="000000"/>
+          <w:sz w:val="24"/>
+        </w:rPr>
         <w:t>展示模块读取完成的结果与统计文件，提供条件对照、轨迹证据和失败案例入口。主确认轨迹保存scores与动作链，未保存世界模型全部预测状态；如需分析预测序列，应使用具有该字段的通用评估入口或另行登记记录方案。页面展示不参与实时控制。</w:t>
       </w:r>
     </w:p>
     <w:p>
       <w:pPr>
         <w:pStyle w:val="Heading2"/>
+        <w:ind w:firstLineChars="0" w:firstLine="0"/>
         <w:jc w:val="left"/>
       </w:pPr>
       <w:r>
@@ -3391,24 +3875,33 @@
     <w:p>
       <w:pPr>
         <w:pStyle w:val="Heading3"/>
+        <w:ind w:firstLineChars="0" w:firstLine="0"/>
         <w:jc w:val="left"/>
       </w:pPr>
       <w:r>
-        <w:t>4.3.1 数据实体及关联</w:t>
+        <w:t>4.3.1  数据实体及关联</w:t>
       </w:r>
     </w:p>
     <w:p>
       <w:pPr>
+        <w:spacing w:line="360" w:lineRule="auto"/>
+        <w:ind w:firstLine="480" w:firstLineChars="200"/>
         <w:jc w:val="both"/>
       </w:pPr>
       <w:r>
+        <w:rPr>
+          <w:rFonts w:ascii="Times New Roman" w:hAnsi="Times New Roman" w:eastAsia="宋体" w:cs="Times New Roman"/>
+          <w:b w:val="0"/>
+          <w:color w:val="000000"/>
+          <w:sz w:val="24"/>
+        </w:rPr>
         <w:t>系统围绕示范轨迹、候选分支、模型检查点、实验作业、回合结果和控制记录组织数据。示范轨迹以demo标识；分支保留parent及锚点，连接其来源轨迹；作业指定模型、起点和控制配置；回合以作业和demo定位；逐步记录由demo与step定位。关系如图4-5所示。</w:t>
       </w:r>
     </w:p>
     <w:p>
       <w:pPr>
         <w:keepNext/>
-        <w:ind w:firstLine="0"/>
+        <w:ind w:firstLine="0" w:firstLineChars="0"/>
         <w:jc w:val="center"/>
       </w:pPr>
       <w:r>
@@ -3451,7 +3944,7 @@
         <w:pStyle w:val="Caption"/>
         <w:keepNext w:val="0"/>
         <w:spacing w:after="120" w:before="120"/>
-        <w:ind w:firstLine="0"/>
+        <w:ind w:firstLine="0" w:firstLineChars="0"/>
         <w:jc w:val="center"/>
       </w:pPr>
       <w:r>
@@ -3460,10 +3953,37 @@
     </w:p>
     <w:p>
       <w:pPr>
+        <w:spacing w:line="360" w:lineRule="auto"/>
+        <w:ind w:firstLine="480" w:firstLineChars="200"/>
         <w:jc w:val="both"/>
       </w:pPr>
       <w:r>
-        <w:t>这些关系由文件元数据和程序校验维护。本项目以HDF5分组保存示范的观测与动作，便于按轨迹读取和划分，满足离线示范学习的数据组织需求[5]；分支训练使用NPZ按候选组装载，模型权重及配置共同写入PT。JSON保存配置与汇总，JSONL按行保存控制轨迹。</w:t>
+        <w:rPr>
+          <w:rFonts w:ascii="Times New Roman" w:hAnsi="Times New Roman" w:eastAsia="宋体" w:cs="Times New Roman"/>
+          <w:b w:val="0"/>
+          <w:color w:val="000000"/>
+          <w:sz w:val="24"/>
+        </w:rPr>
+        <w:t xml:space="preserve">这些关系由文件元数据和程序校验维护。本项目以HDF5分组保存示范的观测与动作，便于按轨迹读取和划分，满足离线示范学习的数据组织需求</w:t>
+      </w:r>
+      <w:r>
+        <w:rPr>
+          <w:rFonts w:ascii="Times New Roman" w:hAnsi="Times New Roman" w:eastAsia="宋体" w:cs="Times New Roman"/>
+          <w:b w:val="0"/>
+          <w:color w:val="000000"/>
+          <w:sz w:val="24"/>
+          <w:vertAlign w:val="superscript"/>
+        </w:rPr>
+        <w:t xml:space="preserve">[5]</w:t>
+      </w:r>
+      <w:r>
+        <w:rPr>
+          <w:rFonts w:ascii="Times New Roman" w:hAnsi="Times New Roman" w:eastAsia="宋体" w:cs="Times New Roman"/>
+          <w:b w:val="0"/>
+          <w:color w:val="000000"/>
+          <w:sz w:val="24"/>
+        </w:rPr>
+        <w:t xml:space="preserve">；分支训练使用NPZ按候选组装载，模型权重及配置共同写入PT。JSON保存配置与汇总，JSONL按行保存控制轨迹。</w:t>
       </w:r>
     </w:p>
     <w:p>
@@ -3471,7 +3991,7 @@
         <w:pStyle w:val="Caption"/>
         <w:keepNext/>
         <w:spacing w:after="120" w:before="120"/>
-        <w:ind w:firstLine="0"/>
+        <w:ind w:firstLine="0" w:firstLineChars="0"/>
         <w:jc w:val="center"/>
       </w:pPr>
       <w:r>
@@ -3519,7 +4039,7 @@
           <w:p>
             <w:pPr>
               <w:spacing w:after="0" w:line="276" w:lineRule="auto"/>
-              <w:ind w:firstLine="0"/>
+              <w:ind w:firstLine="0" w:firstLineChars="0"/>
               <w:jc w:val="center"/>
             </w:pPr>
             <w:r>
@@ -3546,7 +4066,7 @@
           <w:p>
             <w:pPr>
               <w:spacing w:after="0" w:line="276" w:lineRule="auto"/>
-              <w:ind w:firstLine="0"/>
+              <w:ind w:firstLine="0" w:firstLineChars="0"/>
               <w:jc w:val="center"/>
             </w:pPr>
             <w:r>
@@ -3573,7 +4093,7 @@
           <w:p>
             <w:pPr>
               <w:spacing w:after="0" w:line="276" w:lineRule="auto"/>
-              <w:ind w:firstLine="0"/>
+              <w:ind w:firstLine="0" w:firstLineChars="0"/>
               <w:jc w:val="center"/>
             </w:pPr>
             <w:r>
@@ -3600,7 +4120,7 @@
           <w:p>
             <w:pPr>
               <w:spacing w:after="0" w:line="276" w:lineRule="auto"/>
-              <w:ind w:firstLine="0"/>
+              <w:ind w:firstLine="0" w:firstLineChars="0"/>
               <w:jc w:val="center"/>
             </w:pPr>
             <w:r>
@@ -3631,7 +4151,7 @@
           <w:p>
             <w:pPr>
               <w:spacing w:after="0" w:line="276" w:lineRule="auto"/>
-              <w:ind w:firstLine="0"/>
+              <w:ind w:firstLine="0" w:firstLineChars="0"/>
               <w:jc w:val="center"/>
             </w:pPr>
             <w:r>
@@ -3657,7 +4177,7 @@
           <w:p>
             <w:pPr>
               <w:spacing w:after="0" w:line="276" w:lineRule="auto"/>
-              <w:ind w:firstLine="0"/>
+              <w:ind w:firstLine="0" w:firstLineChars="0"/>
               <w:jc w:val="center"/>
             </w:pPr>
             <w:r>
@@ -3683,7 +4203,7 @@
           <w:p>
             <w:pPr>
               <w:spacing w:after="0" w:line="276" w:lineRule="auto"/>
-              <w:ind w:firstLine="0"/>
+              <w:ind w:firstLine="0" w:firstLineChars="0"/>
               <w:jc w:val="center"/>
             </w:pPr>
             <w:r>
@@ -3709,7 +4229,7 @@
           <w:p>
             <w:pPr>
               <w:spacing w:after="0" w:line="276" w:lineRule="auto"/>
-              <w:ind w:firstLine="0"/>
+              <w:ind w:firstLine="0" w:firstLineChars="0"/>
               <w:jc w:val="center"/>
             </w:pPr>
             <w:r>
@@ -3740,7 +4260,7 @@
           <w:p>
             <w:pPr>
               <w:spacing w:after="0" w:line="276" w:lineRule="auto"/>
-              <w:ind w:firstLine="0"/>
+              <w:ind w:firstLine="0" w:firstLineChars="0"/>
               <w:jc w:val="center"/>
             </w:pPr>
             <w:r>
@@ -3766,7 +4286,7 @@
           <w:p>
             <w:pPr>
               <w:spacing w:after="0" w:line="276" w:lineRule="auto"/>
-              <w:ind w:firstLine="0"/>
+              <w:ind w:firstLine="0" w:firstLineChars="0"/>
               <w:jc w:val="center"/>
             </w:pPr>
             <w:r>
@@ -3792,7 +4312,7 @@
           <w:p>
             <w:pPr>
               <w:spacing w:after="0" w:line="276" w:lineRule="auto"/>
-              <w:ind w:firstLine="0"/>
+              <w:ind w:firstLine="0" w:firstLineChars="0"/>
               <w:jc w:val="center"/>
             </w:pPr>
             <w:r>
@@ -3818,7 +4338,7 @@
           <w:p>
             <w:pPr>
               <w:spacing w:after="0" w:line="276" w:lineRule="auto"/>
-              <w:ind w:firstLine="0"/>
+              <w:ind w:firstLine="0" w:firstLineChars="0"/>
               <w:jc w:val="center"/>
             </w:pPr>
             <w:r>
@@ -3849,7 +4369,7 @@
           <w:p>
             <w:pPr>
               <w:spacing w:after="0" w:line="276" w:lineRule="auto"/>
-              <w:ind w:firstLine="0"/>
+              <w:ind w:firstLine="0" w:firstLineChars="0"/>
               <w:jc w:val="center"/>
             </w:pPr>
             <w:r>
@@ -3875,7 +4395,7 @@
           <w:p>
             <w:pPr>
               <w:spacing w:after="0" w:line="276" w:lineRule="auto"/>
-              <w:ind w:firstLine="0"/>
+              <w:ind w:firstLine="0" w:firstLineChars="0"/>
               <w:jc w:val="center"/>
             </w:pPr>
             <w:r>
@@ -3901,7 +4421,7 @@
           <w:p>
             <w:pPr>
               <w:spacing w:after="0" w:line="276" w:lineRule="auto"/>
-              <w:ind w:firstLine="0"/>
+              <w:ind w:firstLine="0" w:firstLineChars="0"/>
               <w:jc w:val="center"/>
             </w:pPr>
             <w:r>
@@ -3927,7 +4447,7 @@
           <w:p>
             <w:pPr>
               <w:spacing w:after="0" w:line="276" w:lineRule="auto"/>
-              <w:ind w:firstLine="0"/>
+              <w:ind w:firstLine="0" w:firstLineChars="0"/>
               <w:jc w:val="center"/>
             </w:pPr>
             <w:r>
@@ -3958,7 +4478,7 @@
           <w:p>
             <w:pPr>
               <w:spacing w:after="0" w:line="276" w:lineRule="auto"/>
-              <w:ind w:firstLine="0"/>
+              <w:ind w:firstLine="0" w:firstLineChars="0"/>
               <w:jc w:val="center"/>
             </w:pPr>
             <w:r>
@@ -3984,7 +4504,7 @@
           <w:p>
             <w:pPr>
               <w:spacing w:after="0" w:line="276" w:lineRule="auto"/>
-              <w:ind w:firstLine="0"/>
+              <w:ind w:firstLine="0" w:firstLineChars="0"/>
               <w:jc w:val="center"/>
             </w:pPr>
             <w:r>
@@ -4010,7 +4530,7 @@
           <w:p>
             <w:pPr>
               <w:spacing w:after="0" w:line="276" w:lineRule="auto"/>
-              <w:ind w:firstLine="0"/>
+              <w:ind w:firstLine="0" w:firstLineChars="0"/>
               <w:jc w:val="center"/>
             </w:pPr>
             <w:r>
@@ -4036,7 +4556,7 @@
           <w:p>
             <w:pPr>
               <w:spacing w:after="0" w:line="276" w:lineRule="auto"/>
-              <w:ind w:firstLine="0"/>
+              <w:ind w:firstLine="0" w:firstLineChars="0"/>
               <w:jc w:val="center"/>
             </w:pPr>
             <w:r>
@@ -4067,7 +4587,7 @@
           <w:p>
             <w:pPr>
               <w:spacing w:after="0" w:line="276" w:lineRule="auto"/>
-              <w:ind w:firstLine="0"/>
+              <w:ind w:firstLine="0" w:firstLineChars="0"/>
               <w:jc w:val="center"/>
             </w:pPr>
             <w:r>
@@ -4093,7 +4613,7 @@
           <w:p>
             <w:pPr>
               <w:spacing w:after="0" w:line="276" w:lineRule="auto"/>
-              <w:ind w:firstLine="0"/>
+              <w:ind w:firstLine="0" w:firstLineChars="0"/>
               <w:jc w:val="center"/>
             </w:pPr>
             <w:r>
@@ -4119,7 +4639,7 @@
           <w:p>
             <w:pPr>
               <w:spacing w:after="0" w:line="276" w:lineRule="auto"/>
-              <w:ind w:firstLine="0"/>
+              <w:ind w:firstLine="0" w:firstLineChars="0"/>
               <w:jc w:val="center"/>
             </w:pPr>
             <w:r>
@@ -4145,7 +4665,7 @@
           <w:p>
             <w:pPr>
               <w:spacing w:after="0" w:line="276" w:lineRule="auto"/>
-              <w:ind w:firstLine="0"/>
+              <w:ind w:firstLine="0" w:firstLineChars="0"/>
               <w:jc w:val="center"/>
             </w:pPr>
             <w:r>
@@ -4176,7 +4696,7 @@
           <w:p>
             <w:pPr>
               <w:spacing w:after="0" w:line="276" w:lineRule="auto"/>
-              <w:ind w:firstLine="0"/>
+              <w:ind w:firstLine="0" w:firstLineChars="0"/>
               <w:jc w:val="center"/>
             </w:pPr>
             <w:r>
@@ -4202,7 +4722,7 @@
           <w:p>
             <w:pPr>
               <w:spacing w:after="0" w:line="276" w:lineRule="auto"/>
-              <w:ind w:firstLine="0"/>
+              <w:ind w:firstLine="0" w:firstLineChars="0"/>
               <w:jc w:val="center"/>
             </w:pPr>
             <w:r>
@@ -4228,7 +4748,7 @@
           <w:p>
             <w:pPr>
               <w:spacing w:after="0" w:line="276" w:lineRule="auto"/>
-              <w:ind w:firstLine="0"/>
+              <w:ind w:firstLine="0" w:firstLineChars="0"/>
               <w:jc w:val="center"/>
             </w:pPr>
             <w:r>
@@ -4254,7 +4774,7 @@
           <w:p>
             <w:pPr>
               <w:spacing w:after="0" w:line="276" w:lineRule="auto"/>
-              <w:ind w:firstLine="0"/>
+              <w:ind w:firstLine="0" w:firstLineChars="0"/>
               <w:jc w:val="center"/>
             </w:pPr>
             <w:r>
@@ -4271,23 +4791,32 @@
     <w:p>
       <w:pPr>
         <w:spacing w:after="60" w:line="120" w:lineRule="auto"/>
-        <w:ind w:firstLine="0"/>
+        <w:ind w:firstLine="0" w:firstLineChars="0"/>
       </w:pPr>
     </w:p>
     <w:p>
       <w:pPr>
         <w:pStyle w:val="Heading3"/>
+        <w:ind w:firstLineChars="0" w:firstLine="0"/>
         <w:jc w:val="left"/>
       </w:pPr>
       <w:r>
-        <w:t>4.3.2 候选分支与检查点结构</w:t>
+        <w:t>4.3.2  候选分支与检查点结构</w:t>
       </w:r>
     </w:p>
     <w:p>
       <w:pPr>
+        <w:spacing w:line="360" w:lineRule="auto"/>
+        <w:ind w:firstLine="480" w:firstLineChars="200"/>
         <w:jc w:val="both"/>
       </w:pPr>
       <w:r>
+        <w:rPr>
+          <w:rFonts w:ascii="Times New Roman" w:hAnsi="Times New Roman" w:eastAsia="宋体" w:cs="Times New Roman"/>
+          <w:b w:val="0"/>
+          <w:color w:val="000000"/>
+          <w:sz w:val="24"/>
+        </w:rPr>
         <w:t>分支数据必须保留同起点的候选组，训练时先抽取组，再把组内候选展开为批量序列。设组数为N，候选数为K=4，时域H=8，主要数组设计如表4-4所示。将同一候选组拆散后随机划分训练与开发会引入共享起点信息，因此数据划分以parent为单位。</w:t>
       </w:r>
     </w:p>
@@ -4296,7 +4825,7 @@
         <w:pStyle w:val="Caption"/>
         <w:keepNext/>
         <w:spacing w:after="120" w:before="120"/>
-        <w:ind w:firstLine="0"/>
+        <w:ind w:firstLine="0" w:firstLineChars="0"/>
         <w:jc w:val="center"/>
       </w:pPr>
       <w:r>
@@ -4343,7 +4872,7 @@
           <w:p>
             <w:pPr>
               <w:spacing w:after="0" w:line="276" w:lineRule="auto"/>
-              <w:ind w:firstLine="0"/>
+              <w:ind w:firstLine="0" w:firstLineChars="0"/>
               <w:jc w:val="center"/>
             </w:pPr>
             <w:r>
@@ -4370,7 +4899,7 @@
           <w:p>
             <w:pPr>
               <w:spacing w:after="0" w:line="276" w:lineRule="auto"/>
-              <w:ind w:firstLine="0"/>
+              <w:ind w:firstLine="0" w:firstLineChars="0"/>
               <w:jc w:val="center"/>
             </w:pPr>
             <w:r>
@@ -4397,7 +4926,7 @@
           <w:p>
             <w:pPr>
               <w:spacing w:after="0" w:line="276" w:lineRule="auto"/>
-              <w:ind w:firstLine="0"/>
+              <w:ind w:firstLine="0" w:firstLineChars="0"/>
               <w:jc w:val="center"/>
             </w:pPr>
             <w:r>
@@ -4428,7 +4957,7 @@
           <w:p>
             <w:pPr>
               <w:spacing w:after="0" w:line="276" w:lineRule="auto"/>
-              <w:ind w:firstLine="0"/>
+              <w:ind w:firstLine="0" w:firstLineChars="0"/>
               <w:jc w:val="center"/>
             </w:pPr>
             <w:r>
@@ -4454,7 +4983,7 @@
           <w:p>
             <w:pPr>
               <w:spacing w:after="0" w:line="276" w:lineRule="auto"/>
-              <w:ind w:firstLine="0"/>
+              <w:ind w:firstLine="0" w:firstLineChars="0"/>
               <w:jc w:val="center"/>
             </w:pPr>
             <w:r>
@@ -4480,7 +5009,7 @@
           <w:p>
             <w:pPr>
               <w:spacing w:after="0" w:line="276" w:lineRule="auto"/>
-              <w:ind w:firstLine="0"/>
+              <w:ind w:firstLine="0" w:firstLineChars="0"/>
               <w:jc w:val="center"/>
             </w:pPr>
             <w:r>
@@ -4511,7 +5040,7 @@
           <w:p>
             <w:pPr>
               <w:spacing w:after="0" w:line="276" w:lineRule="auto"/>
-              <w:ind w:firstLine="0"/>
+              <w:ind w:firstLine="0" w:firstLineChars="0"/>
               <w:jc w:val="center"/>
             </w:pPr>
             <w:r>
@@ -4537,7 +5066,7 @@
           <w:p>
             <w:pPr>
               <w:spacing w:after="0" w:line="276" w:lineRule="auto"/>
-              <w:ind w:firstLine="0"/>
+              <w:ind w:firstLine="0" w:firstLineChars="0"/>
               <w:jc w:val="center"/>
             </w:pPr>
             <w:r>
@@ -4563,7 +5092,7 @@
           <w:p>
             <w:pPr>
               <w:spacing w:after="0" w:line="276" w:lineRule="auto"/>
-              <w:ind w:firstLine="0"/>
+              <w:ind w:firstLine="0" w:firstLineChars="0"/>
               <w:jc w:val="center"/>
             </w:pPr>
             <w:r>
@@ -4594,7 +5123,7 @@
           <w:p>
             <w:pPr>
               <w:spacing w:after="0" w:line="276" w:lineRule="auto"/>
-              <w:ind w:firstLine="0"/>
+              <w:ind w:firstLine="0" w:firstLineChars="0"/>
               <w:jc w:val="center"/>
             </w:pPr>
             <w:r>
@@ -4620,7 +5149,7 @@
           <w:p>
             <w:pPr>
               <w:spacing w:after="0" w:line="276" w:lineRule="auto"/>
-              <w:ind w:firstLine="0"/>
+              <w:ind w:firstLine="0" w:firstLineChars="0"/>
               <w:jc w:val="center"/>
             </w:pPr>
             <w:r>
@@ -4646,7 +5175,7 @@
           <w:p>
             <w:pPr>
               <w:spacing w:after="0" w:line="276" w:lineRule="auto"/>
-              <w:ind w:firstLine="0"/>
+              <w:ind w:firstLine="0" w:firstLineChars="0"/>
               <w:jc w:val="center"/>
             </w:pPr>
             <w:r>
@@ -4677,7 +5206,7 @@
           <w:p>
             <w:pPr>
               <w:spacing w:after="0" w:line="276" w:lineRule="auto"/>
-              <w:ind w:firstLine="0"/>
+              <w:ind w:firstLine="0" w:firstLineChars="0"/>
               <w:jc w:val="center"/>
             </w:pPr>
             <w:r>
@@ -4703,7 +5232,7 @@
           <w:p>
             <w:pPr>
               <w:spacing w:after="0" w:line="276" w:lineRule="auto"/>
-              <w:ind w:firstLine="0"/>
+              <w:ind w:firstLine="0" w:firstLineChars="0"/>
               <w:jc w:val="center"/>
             </w:pPr>
             <w:r>
@@ -4729,7 +5258,7 @@
           <w:p>
             <w:pPr>
               <w:spacing w:after="0" w:line="276" w:lineRule="auto"/>
-              <w:ind w:firstLine="0"/>
+              <w:ind w:firstLine="0" w:firstLineChars="0"/>
               <w:jc w:val="center"/>
             </w:pPr>
             <w:r>
@@ -4760,7 +5289,7 @@
           <w:p>
             <w:pPr>
               <w:spacing w:after="0" w:line="276" w:lineRule="auto"/>
-              <w:ind w:firstLine="0"/>
+              <w:ind w:firstLine="0" w:firstLineChars="0"/>
               <w:jc w:val="center"/>
             </w:pPr>
             <w:r>
@@ -4786,7 +5315,7 @@
           <w:p>
             <w:pPr>
               <w:spacing w:after="0" w:line="276" w:lineRule="auto"/>
-              <w:ind w:firstLine="0"/>
+              <w:ind w:firstLine="0" w:firstLineChars="0"/>
               <w:jc w:val="center"/>
             </w:pPr>
             <w:r>
@@ -4812,7 +5341,7 @@
           <w:p>
             <w:pPr>
               <w:spacing w:after="0" w:line="276" w:lineRule="auto"/>
-              <w:ind w:firstLine="0"/>
+              <w:ind w:firstLine="0" w:firstLineChars="0"/>
               <w:jc w:val="center"/>
             </w:pPr>
             <w:r>
@@ -4843,7 +5372,7 @@
           <w:p>
             <w:pPr>
               <w:spacing w:after="0" w:line="276" w:lineRule="auto"/>
-              <w:ind w:firstLine="0"/>
+              <w:ind w:firstLine="0" w:firstLineChars="0"/>
               <w:jc w:val="center"/>
             </w:pPr>
             <w:r>
@@ -4869,7 +5398,7 @@
           <w:p>
             <w:pPr>
               <w:spacing w:after="0" w:line="276" w:lineRule="auto"/>
-              <w:ind w:firstLine="0"/>
+              <w:ind w:firstLine="0" w:firstLineChars="0"/>
               <w:jc w:val="center"/>
             </w:pPr>
             <w:r>
@@ -4895,7 +5424,7 @@
           <w:p>
             <w:pPr>
               <w:spacing w:after="0" w:line="276" w:lineRule="auto"/>
-              <w:ind w:firstLine="0"/>
+              <w:ind w:firstLine="0" w:firstLineChars="0"/>
               <w:jc w:val="center"/>
             </w:pPr>
             <w:r>
@@ -4926,7 +5455,7 @@
           <w:p>
             <w:pPr>
               <w:spacing w:after="0" w:line="276" w:lineRule="auto"/>
-              <w:ind w:firstLine="0"/>
+              <w:ind w:firstLine="0" w:firstLineChars="0"/>
               <w:jc w:val="center"/>
             </w:pPr>
             <w:r>
@@ -4952,7 +5481,7 @@
           <w:p>
             <w:pPr>
               <w:spacing w:after="0" w:line="276" w:lineRule="auto"/>
-              <w:ind w:firstLine="0"/>
+              <w:ind w:firstLine="0" w:firstLineChars="0"/>
               <w:jc w:val="center"/>
             </w:pPr>
             <w:r>
@@ -4978,7 +5507,7 @@
           <w:p>
             <w:pPr>
               <w:spacing w:after="0" w:line="276" w:lineRule="auto"/>
-              <w:ind w:firstLine="0"/>
+              <w:ind w:firstLine="0" w:firstLineChars="0"/>
               <w:jc w:val="center"/>
             </w:pPr>
             <w:r>
@@ -5009,7 +5538,7 @@
           <w:p>
             <w:pPr>
               <w:spacing w:after="0" w:line="276" w:lineRule="auto"/>
-              <w:ind w:firstLine="0"/>
+              <w:ind w:firstLine="0" w:firstLineChars="0"/>
               <w:jc w:val="left"/>
             </w:pPr>
             <w:r>
@@ -5035,7 +5564,7 @@
           <w:p>
             <w:pPr>
               <w:spacing w:after="0" w:line="276" w:lineRule="auto"/>
-              <w:ind w:firstLine="0"/>
+              <w:ind w:firstLine="0" w:firstLineChars="0"/>
               <w:jc w:val="center"/>
             </w:pPr>
             <w:r>
@@ -5061,7 +5590,7 @@
           <w:p>
             <w:pPr>
               <w:spacing w:after="0" w:line="276" w:lineRule="auto"/>
-              <w:ind w:firstLine="0"/>
+              <w:ind w:firstLine="0" w:firstLineChars="0"/>
               <w:jc w:val="center"/>
             </w:pPr>
             <w:r>
@@ -5078,47 +5607,80 @@
     <w:p>
       <w:pPr>
         <w:spacing w:after="60" w:line="120" w:lineRule="auto"/>
-        <w:ind w:firstLine="0"/>
+        <w:ind w:firstLine="0" w:firstLineChars="0"/>
       </w:pPr>
     </w:p>
     <w:p>
       <w:pPr>
+        <w:spacing w:line="360" w:lineRule="auto"/>
+        <w:ind w:firstLine="480" w:firstLineChars="200"/>
         <w:jc w:val="both"/>
       </w:pPr>
       <w:r>
+        <w:rPr>
+          <w:rFonts w:ascii="Times New Roman" w:hAnsi="Times New Roman" w:eastAsia="宋体" w:cs="Times New Roman"/>
+          <w:b w:val="0"/>
+          <w:color w:val="000000"/>
+          <w:sz w:val="24"/>
+        </w:rPr>
         <w:t>正式分支文件不含observation_semantics，加载时按legacy解释；新canonical分支须显式声明语义并核对几何一致性。point表示锚点之前已执行的控制步数，不是原示范帧索引。parent用于检查父轨迹隔离，缺失时无法完成同等检查，不应直接用于正式比较。</w:t>
       </w:r>
     </w:p>
     <w:p>
       <w:pPr>
+        <w:spacing w:line="360" w:lineRule="auto"/>
+        <w:ind w:firstLine="480" w:firstLineChars="200"/>
         <w:jc w:val="both"/>
       </w:pPr>
       <w:r>
+        <w:rPr>
+          <w:rFonts w:ascii="Times New Roman" w:hAnsi="Times New Roman" w:eastAsia="宋体" w:cs="Times New Roman"/>
+          <w:b w:val="0"/>
+          <w:color w:val="000000"/>
+          <w:sz w:val="24"/>
+        </w:rPr>
         <w:t>检查点的state_dict保存网络权重与标准化缓冲量。世界模型config包含dim、horizon、width、method及seed；BC配置包含dim、horizon、width及mixtures，未必含method。新BC配置记录architecture；历史检查点缺省为MLP，观测语义缺省为legacy。加载时核对任务契约，正式Full另要求future_only为真。</w:t>
       </w:r>
     </w:p>
     <w:p>
       <w:pPr>
         <w:pStyle w:val="Heading3"/>
+        <w:ind w:firstLineChars="0" w:firstLine="0"/>
         <w:jc w:val="left"/>
       </w:pPr>
       <w:r>
-        <w:t>4.3.3 作业与执行记录结构</w:t>
+        <w:t>4.3.3  作业与执行记录结构</w:t>
       </w:r>
     </w:p>
     <w:p>
       <w:pPr>
+        <w:spacing w:line="360" w:lineRule="auto"/>
+        <w:ind w:firstLine="480" w:firstLineChars="200"/>
         <w:jc w:val="both"/>
       </w:pPr>
       <w:r>
+        <w:rPr>
+          <w:rFonts w:ascii="Times New Roman" w:hAnsi="Times New Roman" w:eastAsia="宋体" w:cs="Times New Roman"/>
+          <w:b w:val="0"/>
+          <w:color w:val="000000"/>
+          <w:sz w:val="24"/>
+        </w:rPr>
         <w:t>作业由id、method、seed、controller、semantics、noise、demos、steps和delay等字段组成。正式恢复作业限定method为bc或full，controller为none、v5或queue_budget，steps为400、delay为2。Full使用三个已登记的固定模型种子，起点列表必须非空且无重复。</w:t>
       </w:r>
     </w:p>
     <w:p>
       <w:pPr>
+        <w:spacing w:line="360" w:lineRule="auto"/>
+        <w:ind w:firstLine="480" w:firstLineChars="200"/>
         <w:jc w:val="both"/>
       </w:pPr>
       <w:r>
+        <w:rPr>
+          <w:rFonts w:ascii="Times New Roman" w:hAnsi="Times New Roman" w:eastAsia="宋体" w:cs="Times New Roman"/>
+          <w:b w:val="0"/>
+          <w:color w:val="000000"/>
+          <w:sz w:val="24"/>
+        </w:rPr>
         <w:t>result.json包含作业副本、运行状态及回合records。每个回合记录成功与终止步数、干预步数、尝试次数、恢复事件及计时。trace.jsonl按表4-5记录完整控制链，使候选建议、恢复覆盖和延迟执行可以逐项区分。</w:t>
       </w:r>
     </w:p>
@@ -5127,7 +5689,7 @@
         <w:pStyle w:val="Caption"/>
         <w:keepNext/>
         <w:spacing w:after="120" w:before="120"/>
-        <w:ind w:firstLine="0"/>
+        <w:ind w:firstLine="0" w:firstLineChars="0"/>
         <w:jc w:val="center"/>
       </w:pPr>
       <w:r>
@@ -5174,7 +5736,7 @@
           <w:p>
             <w:pPr>
               <w:spacing w:after="0" w:line="276" w:lineRule="auto"/>
-              <w:ind w:firstLine="0"/>
+              <w:ind w:firstLine="0" w:firstLineChars="0"/>
               <w:jc w:val="center"/>
             </w:pPr>
             <w:r>
@@ -5201,7 +5763,7 @@
           <w:p>
             <w:pPr>
               <w:spacing w:after="0" w:line="276" w:lineRule="auto"/>
-              <w:ind w:firstLine="0"/>
+              <w:ind w:firstLine="0" w:firstLineChars="0"/>
               <w:jc w:val="center"/>
             </w:pPr>
             <w:r>
@@ -5228,7 +5790,7 @@
           <w:p>
             <w:pPr>
               <w:spacing w:after="0" w:line="276" w:lineRule="auto"/>
-              <w:ind w:firstLine="0"/>
+              <w:ind w:firstLine="0" w:firstLineChars="0"/>
               <w:jc w:val="center"/>
             </w:pPr>
             <w:r>
@@ -5259,7 +5821,7 @@
           <w:p>
             <w:pPr>
               <w:spacing w:after="0" w:line="276" w:lineRule="auto"/>
-              <w:ind w:firstLine="0"/>
+              <w:ind w:firstLine="0" w:firstLineChars="0"/>
               <w:jc w:val="center"/>
             </w:pPr>
             <w:r>
@@ -5285,7 +5847,7 @@
           <w:p>
             <w:pPr>
               <w:spacing w:after="0" w:line="276" w:lineRule="auto"/>
-              <w:ind w:firstLine="0"/>
+              <w:ind w:firstLine="0" w:firstLineChars="0"/>
               <w:jc w:val="center"/>
             </w:pPr>
             <w:r>
@@ -5311,7 +5873,7 @@
           <w:p>
             <w:pPr>
               <w:spacing w:after="0" w:line="276" w:lineRule="auto"/>
-              <w:ind w:firstLine="0"/>
+              <w:ind w:firstLine="0" w:firstLineChars="0"/>
               <w:jc w:val="center"/>
             </w:pPr>
             <w:r>
@@ -5342,7 +5904,7 @@
           <w:p>
             <w:pPr>
               <w:spacing w:after="0" w:line="276" w:lineRule="auto"/>
-              <w:ind w:firstLine="0"/>
+              <w:ind w:firstLine="0" w:firstLineChars="0"/>
               <w:jc w:val="center"/>
             </w:pPr>
             <w:r>
@@ -5368,7 +5930,7 @@
           <w:p>
             <w:pPr>
               <w:spacing w:after="0" w:line="276" w:lineRule="auto"/>
-              <w:ind w:firstLine="0"/>
+              <w:ind w:firstLine="0" w:firstLineChars="0"/>
               <w:jc w:val="left"/>
             </w:pPr>
             <w:r>
@@ -5394,7 +5956,7 @@
           <w:p>
             <w:pPr>
               <w:spacing w:after="0" w:line="276" w:lineRule="auto"/>
-              <w:ind w:firstLine="0"/>
+              <w:ind w:firstLine="0" w:firstLineChars="0"/>
               <w:jc w:val="center"/>
             </w:pPr>
             <w:r>
@@ -5425,7 +5987,7 @@
           <w:p>
             <w:pPr>
               <w:spacing w:after="0" w:line="276" w:lineRule="auto"/>
-              <w:ind w:firstLine="0"/>
+              <w:ind w:firstLine="0" w:firstLineChars="0"/>
               <w:jc w:val="center"/>
             </w:pPr>
             <w:r>
@@ -5451,7 +6013,7 @@
           <w:p>
             <w:pPr>
               <w:spacing w:after="0" w:line="276" w:lineRule="auto"/>
-              <w:ind w:firstLine="0"/>
+              <w:ind w:firstLine="0" w:firstLineChars="0"/>
               <w:jc w:val="left"/>
             </w:pPr>
             <w:r>
@@ -5477,7 +6039,7 @@
           <w:p>
             <w:pPr>
               <w:spacing w:after="0" w:line="276" w:lineRule="auto"/>
-              <w:ind w:firstLine="0"/>
+              <w:ind w:firstLine="0" w:firstLineChars="0"/>
               <w:jc w:val="center"/>
             </w:pPr>
             <w:r>
@@ -5508,7 +6070,7 @@
           <w:p>
             <w:pPr>
               <w:spacing w:after="0" w:line="276" w:lineRule="auto"/>
-              <w:ind w:firstLine="0"/>
+              <w:ind w:firstLine="0" w:firstLineChars="0"/>
               <w:jc w:val="center"/>
             </w:pPr>
             <w:r>
@@ -5534,7 +6096,7 @@
           <w:p>
             <w:pPr>
               <w:spacing w:after="0" w:line="276" w:lineRule="auto"/>
-              <w:ind w:firstLine="0"/>
+              <w:ind w:firstLine="0" w:firstLineChars="0"/>
               <w:jc w:val="left"/>
             </w:pPr>
             <w:r>
@@ -5560,7 +6122,7 @@
           <w:p>
             <w:pPr>
               <w:spacing w:after="0" w:line="276" w:lineRule="auto"/>
-              <w:ind w:firstLine="0"/>
+              <w:ind w:firstLine="0" w:firstLineChars="0"/>
               <w:jc w:val="center"/>
             </w:pPr>
             <w:r>
@@ -5591,7 +6153,7 @@
           <w:p>
             <w:pPr>
               <w:spacing w:after="0" w:line="276" w:lineRule="auto"/>
-              <w:ind w:firstLine="0"/>
+              <w:ind w:firstLine="0" w:firstLineChars="0"/>
               <w:jc w:val="center"/>
             </w:pPr>
             <w:r>
@@ -5617,7 +6179,7 @@
           <w:p>
             <w:pPr>
               <w:spacing w:after="0" w:line="276" w:lineRule="auto"/>
-              <w:ind w:firstLine="0"/>
+              <w:ind w:firstLine="0" w:firstLineChars="0"/>
               <w:jc w:val="left"/>
             </w:pPr>
             <w:r>
@@ -5643,7 +6205,7 @@
           <w:p>
             <w:pPr>
               <w:spacing w:after="0" w:line="276" w:lineRule="auto"/>
-              <w:ind w:firstLine="0"/>
+              <w:ind w:firstLine="0" w:firstLineChars="0"/>
               <w:jc w:val="center"/>
             </w:pPr>
             <w:r>
@@ -5674,7 +6236,7 @@
           <w:p>
             <w:pPr>
               <w:spacing w:after="0" w:line="276" w:lineRule="auto"/>
-              <w:ind w:firstLine="0"/>
+              <w:ind w:firstLine="0" w:firstLineChars="0"/>
               <w:jc w:val="center"/>
             </w:pPr>
             <w:r>
@@ -5700,7 +6262,7 @@
           <w:p>
             <w:pPr>
               <w:spacing w:after="0" w:line="276" w:lineRule="auto"/>
-              <w:ind w:firstLine="0"/>
+              <w:ind w:firstLine="0" w:firstLineChars="0"/>
               <w:jc w:val="left"/>
             </w:pPr>
             <w:r>
@@ -5726,7 +6288,7 @@
           <w:p>
             <w:pPr>
               <w:spacing w:after="0" w:line="276" w:lineRule="auto"/>
-              <w:ind w:firstLine="0"/>
+              <w:ind w:firstLine="0" w:firstLineChars="0"/>
               <w:jc w:val="center"/>
             </w:pPr>
             <w:r>
@@ -5757,7 +6319,7 @@
           <w:p>
             <w:pPr>
               <w:spacing w:after="0" w:line="276" w:lineRule="auto"/>
-              <w:ind w:firstLine="0"/>
+              <w:ind w:firstLine="0" w:firstLineChars="0"/>
               <w:jc w:val="center"/>
             </w:pPr>
             <w:r>
@@ -5783,7 +6345,7 @@
           <w:p>
             <w:pPr>
               <w:spacing w:after="0" w:line="276" w:lineRule="auto"/>
-              <w:ind w:firstLine="0"/>
+              <w:ind w:firstLine="0" w:firstLineChars="0"/>
               <w:jc w:val="center"/>
             </w:pPr>
             <w:r>
@@ -5809,7 +6371,7 @@
           <w:p>
             <w:pPr>
               <w:spacing w:after="0" w:line="276" w:lineRule="auto"/>
-              <w:ind w:firstLine="0"/>
+              <w:ind w:firstLine="0" w:firstLineChars="0"/>
               <w:jc w:val="center"/>
             </w:pPr>
             <w:r>
@@ -5826,20 +6388,29 @@
     <w:p>
       <w:pPr>
         <w:spacing w:after="60" w:line="120" w:lineRule="auto"/>
-        <w:ind w:firstLine="0"/>
+        <w:ind w:firstLine="0" w:firstLineChars="0"/>
       </w:pPr>
     </w:p>
     <w:p>
       <w:pPr>
+        <w:spacing w:line="360" w:lineRule="auto"/>
+        <w:ind w:firstLine="480" w:firstLineChars="200"/>
         <w:jc w:val="both"/>
       </w:pPr>
       <w:r>
+        <w:rPr>
+          <w:rFonts w:ascii="Times New Roman" w:hAnsi="Times New Roman" w:eastAsia="宋体" w:cs="Times New Roman"/>
+          <w:b w:val="0"/>
+          <w:color w:val="000000"/>
+          <w:sz w:val="24"/>
+        </w:rPr>
         <w:t>加噪前的出队命令另存executed_action_before_noise。活动恢复诊断中，mode对应本步生成动作的阶段，next_mode为转移后的状态。compute_ms包含观测打包、BC、可选世界模型和恢复计算，不含物理推进与文件写入。输出目录拒绝复用，result.json.status区分单作业的running、complete和failed；批次通过完成回执与来源一致性检查后进入统计。</w:t>
       </w:r>
     </w:p>
     <w:p>
       <w:pPr>
         <w:pStyle w:val="Heading2"/>
+        <w:ind w:firstLineChars="0" w:firstLine="0"/>
         <w:jc w:val="left"/>
       </w:pPr>
       <w:r>
@@ -5849,17 +6420,26 @@
     <w:p>
       <w:pPr>
         <w:pStyle w:val="Heading3"/>
+        <w:ind w:firstLineChars="0" w:firstLine="0"/>
         <w:jc w:val="left"/>
       </w:pPr>
       <w:r>
-        <w:t>4.4.1 模块接口</w:t>
+        <w:t>4.4.1  模块接口</w:t>
       </w:r>
     </w:p>
     <w:p>
       <w:pPr>
+        <w:spacing w:line="360" w:lineRule="auto"/>
+        <w:ind w:firstLine="480" w:firstLineChars="200"/>
         <w:jc w:val="both"/>
       </w:pPr>
       <w:r>
+        <w:rPr>
+          <w:rFonts w:ascii="Times New Roman" w:hAnsi="Times New Roman" w:eastAsia="宋体" w:cs="Times New Roman"/>
+          <w:b w:val="0"/>
+          <w:color w:val="000000"/>
+          <w:sz w:val="24"/>
+        </w:rPr>
         <w:t>系统采用同一Python进程内的函数调用，传递NumPy数组或PyTorch张量。主要接口如表4-6所示，其中B为批量大小，K=4；输入单位和语义沿用前述状态与动作约定。</w:t>
       </w:r>
     </w:p>
@@ -5868,7 +6448,7 @@
         <w:pStyle w:val="Caption"/>
         <w:keepNext/>
         <w:spacing w:after="120" w:before="120"/>
-        <w:ind w:firstLine="0"/>
+        <w:ind w:firstLine="0" w:firstLineChars="0"/>
         <w:jc w:val="center"/>
       </w:pPr>
       <w:r>
@@ -5916,7 +6496,7 @@
           <w:p>
             <w:pPr>
               <w:spacing w:after="0" w:line="276" w:lineRule="auto"/>
-              <w:ind w:firstLine="0"/>
+              <w:ind w:firstLine="0" w:firstLineChars="0"/>
               <w:jc w:val="center"/>
             </w:pPr>
             <w:r>
@@ -5943,7 +6523,7 @@
           <w:p>
             <w:pPr>
               <w:spacing w:after="0" w:line="276" w:lineRule="auto"/>
-              <w:ind w:firstLine="0"/>
+              <w:ind w:firstLine="0" w:firstLineChars="0"/>
               <w:jc w:val="center"/>
             </w:pPr>
             <w:r>
@@ -5970,7 +6550,7 @@
           <w:p>
             <w:pPr>
               <w:spacing w:after="0" w:line="276" w:lineRule="auto"/>
-              <w:ind w:firstLine="0"/>
+              <w:ind w:firstLine="0" w:firstLineChars="0"/>
               <w:jc w:val="center"/>
             </w:pPr>
             <w:r>
@@ -5997,7 +6577,7 @@
           <w:p>
             <w:pPr>
               <w:spacing w:after="0" w:line="276" w:lineRule="auto"/>
-              <w:ind w:firstLine="0"/>
+              <w:ind w:firstLine="0" w:firstLineChars="0"/>
               <w:jc w:val="center"/>
             </w:pPr>
             <w:r>
@@ -6028,7 +6608,7 @@
           <w:p>
             <w:pPr>
               <w:spacing w:after="0" w:line="276" w:lineRule="auto"/>
-              <w:ind w:firstLine="0"/>
+              <w:ind w:firstLine="0" w:firstLineChars="0"/>
               <w:jc w:val="center"/>
             </w:pPr>
             <w:r>
@@ -6054,7 +6634,7 @@
           <w:p>
             <w:pPr>
               <w:spacing w:after="0" w:line="276" w:lineRule="auto"/>
-              <w:ind w:firstLine="0"/>
+              <w:ind w:firstLine="0" w:firstLineChars="0"/>
               <w:jc w:val="center"/>
             </w:pPr>
             <w:r>
@@ -6080,7 +6660,7 @@
           <w:p>
             <w:pPr>
               <w:spacing w:after="0" w:line="276" w:lineRule="auto"/>
-              <w:ind w:firstLine="0"/>
+              <w:ind w:firstLine="0" w:firstLineChars="0"/>
               <w:jc w:val="center"/>
             </w:pPr>
             <w:r>
@@ -6106,7 +6686,7 @@
           <w:p>
             <w:pPr>
               <w:spacing w:after="0" w:line="276" w:lineRule="auto"/>
-              <w:ind w:firstLine="0"/>
+              <w:ind w:firstLine="0" w:firstLineChars="0"/>
               <w:jc w:val="center"/>
             </w:pPr>
             <w:r>
@@ -6137,7 +6717,7 @@
           <w:p>
             <w:pPr>
               <w:spacing w:after="0" w:line="276" w:lineRule="auto"/>
-              <w:ind w:firstLine="0"/>
+              <w:ind w:firstLine="0" w:firstLineChars="0"/>
               <w:jc w:val="center"/>
             </w:pPr>
             <w:r>
@@ -6163,7 +6743,7 @@
           <w:p>
             <w:pPr>
               <w:spacing w:after="0" w:line="276" w:lineRule="auto"/>
-              <w:ind w:firstLine="0"/>
+              <w:ind w:firstLine="0" w:firstLineChars="0"/>
               <w:jc w:val="center"/>
             </w:pPr>
             <w:r>
@@ -6189,7 +6769,7 @@
           <w:p>
             <w:pPr>
               <w:spacing w:after="0" w:line="276" w:lineRule="auto"/>
-              <w:ind w:firstLine="0"/>
+              <w:ind w:firstLine="0" w:firstLineChars="0"/>
               <w:jc w:val="center"/>
             </w:pPr>
             <w:r>
@@ -6215,7 +6795,7 @@
           <w:p>
             <w:pPr>
               <w:spacing w:after="0" w:line="276" w:lineRule="auto"/>
-              <w:ind w:firstLine="0"/>
+              <w:ind w:firstLine="0" w:firstLineChars="0"/>
               <w:jc w:val="center"/>
             </w:pPr>
             <w:r>
@@ -6246,7 +6826,7 @@
           <w:p>
             <w:pPr>
               <w:spacing w:after="0" w:line="276" w:lineRule="auto"/>
-              <w:ind w:firstLine="0"/>
+              <w:ind w:firstLine="0" w:firstLineChars="0"/>
               <w:jc w:val="left"/>
             </w:pPr>
             <w:r>
@@ -6272,7 +6852,7 @@
           <w:p>
             <w:pPr>
               <w:spacing w:after="0" w:line="276" w:lineRule="auto"/>
-              <w:ind w:firstLine="0"/>
+              <w:ind w:firstLine="0" w:firstLineChars="0"/>
               <w:jc w:val="center"/>
             </w:pPr>
             <w:r>
@@ -6298,7 +6878,7 @@
           <w:p>
             <w:pPr>
               <w:spacing w:after="0" w:line="276" w:lineRule="auto"/>
-              <w:ind w:firstLine="0"/>
+              <w:ind w:firstLine="0" w:firstLineChars="0"/>
               <w:jc w:val="left"/>
             </w:pPr>
             <w:r>
@@ -6324,7 +6904,7 @@
           <w:p>
             <w:pPr>
               <w:spacing w:after="0" w:line="276" w:lineRule="auto"/>
-              <w:ind w:firstLine="0"/>
+              <w:ind w:firstLine="0" w:firstLineChars="0"/>
               <w:jc w:val="center"/>
             </w:pPr>
             <w:r>
@@ -6355,7 +6935,7 @@
           <w:p>
             <w:pPr>
               <w:spacing w:after="0" w:line="276" w:lineRule="auto"/>
-              <w:ind w:firstLine="0"/>
+              <w:ind w:firstLine="0" w:firstLineChars="0"/>
               <w:jc w:val="left"/>
             </w:pPr>
             <w:r>
@@ -6381,7 +6961,7 @@
           <w:p>
             <w:pPr>
               <w:spacing w:after="0" w:line="276" w:lineRule="auto"/>
-              <w:ind w:firstLine="0"/>
+              <w:ind w:firstLine="0" w:firstLineChars="0"/>
               <w:jc w:val="center"/>
             </w:pPr>
             <w:r>
@@ -6407,7 +6987,7 @@
           <w:p>
             <w:pPr>
               <w:spacing w:after="0" w:line="276" w:lineRule="auto"/>
-              <w:ind w:firstLine="0"/>
+              <w:ind w:firstLine="0" w:firstLineChars="0"/>
               <w:jc w:val="center"/>
             </w:pPr>
             <w:r>
@@ -6433,7 +7013,7 @@
           <w:p>
             <w:pPr>
               <w:spacing w:after="0" w:line="276" w:lineRule="auto"/>
-              <w:ind w:firstLine="0"/>
+              <w:ind w:firstLine="0" w:firstLineChars="0"/>
               <w:jc w:val="center"/>
             </w:pPr>
             <w:r>
@@ -6464,7 +7044,7 @@
           <w:p>
             <w:pPr>
               <w:spacing w:after="0" w:line="276" w:lineRule="auto"/>
-              <w:ind w:firstLine="0"/>
+              <w:ind w:firstLine="0" w:firstLineChars="0"/>
               <w:jc w:val="center"/>
             </w:pPr>
             <w:r>
@@ -6490,7 +7070,7 @@
           <w:p>
             <w:pPr>
               <w:spacing w:after="0" w:line="276" w:lineRule="auto"/>
-              <w:ind w:firstLine="0"/>
+              <w:ind w:firstLine="0" w:firstLineChars="0"/>
               <w:jc w:val="center"/>
             </w:pPr>
             <w:r>
@@ -6516,7 +7096,7 @@
           <w:p>
             <w:pPr>
               <w:spacing w:after="0" w:line="276" w:lineRule="auto"/>
-              <w:ind w:firstLine="0"/>
+              <w:ind w:firstLine="0" w:firstLineChars="0"/>
               <w:jc w:val="center"/>
             </w:pPr>
             <w:r>
@@ -6542,7 +7122,7 @@
           <w:p>
             <w:pPr>
               <w:spacing w:after="0" w:line="276" w:lineRule="auto"/>
-              <w:ind w:firstLine="0"/>
+              <w:ind w:firstLine="0" w:firstLineChars="0"/>
               <w:jc w:val="center"/>
             </w:pPr>
             <w:r>
@@ -6573,7 +7153,7 @@
           <w:p>
             <w:pPr>
               <w:spacing w:after="0" w:line="276" w:lineRule="auto"/>
-              <w:ind w:firstLine="0"/>
+              <w:ind w:firstLine="0" w:firstLineChars="0"/>
               <w:jc w:val="left"/>
             </w:pPr>
             <w:r>
@@ -6599,7 +7179,7 @@
           <w:p>
             <w:pPr>
               <w:spacing w:after="0" w:line="276" w:lineRule="auto"/>
-              <w:ind w:firstLine="0"/>
+              <w:ind w:firstLine="0" w:firstLineChars="0"/>
               <w:jc w:val="center"/>
             </w:pPr>
             <w:r>
@@ -6625,7 +7205,7 @@
           <w:p>
             <w:pPr>
               <w:spacing w:after="0" w:line="276" w:lineRule="auto"/>
-              <w:ind w:firstLine="0"/>
+              <w:ind w:firstLine="0" w:firstLineChars="0"/>
               <w:jc w:val="center"/>
             </w:pPr>
             <w:r>
@@ -6651,7 +7231,7 @@
           <w:p>
             <w:pPr>
               <w:spacing w:after="0" w:line="276" w:lineRule="auto"/>
-              <w:ind w:firstLine="0"/>
+              <w:ind w:firstLine="0" w:firstLineChars="0"/>
               <w:jc w:val="center"/>
             </w:pPr>
             <w:r>
@@ -6668,38 +7248,74 @@
     <w:p>
       <w:pPr>
         <w:spacing w:after="60" w:line="120" w:lineRule="auto"/>
-        <w:ind w:firstLine="0"/>
+        <w:ind w:firstLine="0" w:firstLineChars="0"/>
       </w:pPr>
     </w:p>
     <w:p>
       <w:pPr>
+        <w:spacing w:line="360" w:lineRule="auto"/>
+        <w:ind w:firstLine="480" w:firstLineChars="200"/>
         <w:jc w:val="both"/>
       </w:pPr>
       <w:r>
-        <w:t>启动时核对状态维数、动作时域和控制比例。操作空间位姿控制器（OSC_POSE）采用世界参考系增量控制，平移每轴输出上限为0.05 m、旋转每轴上限为0.5 rad，接口原理参见官方文档[6]，具体数值由环境配置确定。归一化命令与控制比例的乘积不等于接触状态下必然实现的末端位移。</w:t>
+        <w:rPr>
+          <w:rFonts w:ascii="Times New Roman" w:hAnsi="Times New Roman" w:eastAsia="宋体" w:cs="Times New Roman"/>
+          <w:b w:val="0"/>
+          <w:color w:val="000000"/>
+          <w:sz w:val="24"/>
+        </w:rPr>
+        <w:t xml:space="preserve">启动时核对状态维数、动作时域和控制比例。操作空间位姿控制器（OSC_POSE）采用世界参考系增量控制，平移每轴输出上限为0.05 m、旋转每轴上限为0.5 rad，接口原理参见官方文档</w:t>
+      </w:r>
+      <w:r>
+        <w:rPr>
+          <w:rFonts w:ascii="Times New Roman" w:hAnsi="Times New Roman" w:eastAsia="宋体" w:cs="Times New Roman"/>
+          <w:b w:val="0"/>
+          <w:color w:val="000000"/>
+          <w:sz w:val="24"/>
+          <w:vertAlign w:val="superscript"/>
+        </w:rPr>
+        <w:t xml:space="preserve">[6]</w:t>
+      </w:r>
+      <w:r>
+        <w:rPr>
+          <w:rFonts w:ascii="Times New Roman" w:hAnsi="Times New Roman" w:eastAsia="宋体" w:cs="Times New Roman"/>
+          <w:b w:val="0"/>
+          <w:color w:val="000000"/>
+          <w:sz w:val="24"/>
+        </w:rPr>
+        <w:t xml:space="preserve">，具体数值由环境配置确定。归一化命令与控制比例的乘积不等于接触状态下必然实现的末端位移。</w:t>
       </w:r>
     </w:p>
     <w:p>
       <w:pPr>
         <w:pStyle w:val="Heading3"/>
+        <w:ind w:firstLineChars="0" w:firstLine="0"/>
         <w:jc w:val="left"/>
       </w:pPr>
       <w:r>
-        <w:t>4.4.2 闭环调用时序</w:t>
+        <w:t>4.4.2  闭环调用时序</w:t>
       </w:r>
     </w:p>
     <w:p>
       <w:pPr>
+        <w:spacing w:line="360" w:lineRule="auto"/>
+        <w:ind w:firstLine="480" w:firstLineChars="200"/>
         <w:jc w:val="both"/>
       </w:pPr>
       <w:r>
+        <w:rPr>
+          <w:rFonts w:ascii="Times New Roman" w:hAnsi="Times New Roman" w:eastAsia="宋体" w:cs="Times New Roman"/>
+          <w:b w:val="0"/>
+          <w:color w:val="000000"/>
+          <w:sz w:val="24"/>
+        </w:rPr>
         <w:t>闭环先构建状态并调用BC，再依据真实队列评价候选；恢复监督器可覆盖建议，最终提交动作才进入队列。出队后加噪并限幅，环境执行并返回新观测。调用顺序如图4-6所示。</w:t>
       </w:r>
     </w:p>
     <w:p>
       <w:pPr>
         <w:keepNext/>
-        <w:ind w:firstLine="0"/>
+        <w:ind w:firstLine="0" w:firstLineChars="0"/>
         <w:jc w:val="center"/>
       </w:pPr>
       <w:r>
@@ -6742,7 +7358,7 @@
         <w:pStyle w:val="Caption"/>
         <w:keepNext w:val="0"/>
         <w:spacing w:after="120" w:before="120"/>
-        <w:ind w:firstLine="0"/>
+        <w:ind w:firstLine="0" w:firstLineChars="0"/>
         <w:jc w:val="center"/>
       </w:pPr>
       <w:r>
@@ -6751,40 +7367,66 @@
     </w:p>
     <w:p>
       <w:pPr>
+        <w:spacing w:line="360" w:lineRule="auto"/>
+        <w:ind w:firstLine="480" w:firstLineChars="200"/>
         <w:jc w:val="both"/>
       </w:pPr>
       <w:r>
+        <w:rPr>
+          <w:rFonts w:ascii="Times New Roman" w:hAnsi="Times New Roman" w:eastAsia="宋体" w:cs="Times New Roman"/>
+          <w:b w:val="0"/>
+          <w:color w:val="000000"/>
+          <w:sz w:val="24"/>
+        </w:rPr>
         <w:t>恢复器中的previous_action必须是上一周期已经实际执行、经过加噪和限幅的动作，而不是上一条新提交命令。对预算扩展，评估器在choose前提供当前队列副本。环境成功检查位于执行之后，仅决定记录与回合终止；其结果不会进入恢复器触发条件。</w:t>
       </w:r>
     </w:p>
     <w:p>
       <w:pPr>
         <w:pStyle w:val="Heading3"/>
+        <w:ind w:firstLineChars="0" w:firstLine="0"/>
         <w:jc w:val="left"/>
       </w:pPr>
       <w:r>
-        <w:t>4.4.3 配置与异常处理</w:t>
+        <w:t>4.4.3  配置与异常处理</w:t>
       </w:r>
     </w:p>
     <w:p>
       <w:pPr>
+        <w:spacing w:line="360" w:lineRule="auto"/>
+        <w:ind w:firstLine="480" w:firstLineChars="200"/>
         <w:jc w:val="both"/>
       </w:pPr>
       <w:r>
+        <w:rPr>
+          <w:rFonts w:ascii="Times New Roman" w:hAnsi="Times New Roman" w:eastAsia="宋体" w:cs="Times New Roman"/>
+          <w:b w:val="0"/>
+          <w:color w:val="000000"/>
+          <w:sz w:val="24"/>
+        </w:rPr>
         <w:t>启动时检查模型配置、观测语义、起点存在性及控制预算，运行时构造两项FIFO并在Full候选展开时核对队列形状。正式Full仅接受legacy与已登记模型种子；控制器延迟和上限须与实际执行一致。模型方法不支持所选读出时拒绝启动，防止使用未训练标签头产生评分。</w:t>
       </w:r>
     </w:p>
     <w:p>
       <w:pPr>
+        <w:spacing w:line="360" w:lineRule="auto"/>
+        <w:ind w:firstLine="480" w:firstLineChars="200"/>
         <w:jc w:val="both"/>
       </w:pPr>
       <w:r>
+        <w:rPr>
+          <w:rFonts w:ascii="Times New Roman" w:hAnsi="Times New Roman" w:eastAsia="宋体" w:cs="Times New Roman"/>
+          <w:b w:val="0"/>
+          <w:color w:val="000000"/>
+          <w:sz w:val="24"/>
+        </w:rPr>
         <w:t>运行异常时保留已有轨迹并尝试写入failed状态，结束时释放仿真环境。结果文件分次写入；发生记录故障时保留原尝试，在新目录使用相同冻结输入重新执行，并比较重复前缀。来源哈希与作业快照用于检测文件变化，重复执行不增加独立样本数。</w:t>
       </w:r>
     </w:p>
     <w:p>
       <w:pPr>
         <w:pStyle w:val="Heading2"/>
+        <w:ind w:firstLineChars="0" w:firstLine="0"/>
         <w:jc w:val="left"/>
       </w:pPr>
       <w:r>
@@ -6794,15 +7436,24 @@
     <w:p>
       <w:pPr>
         <w:keepLines/>
+        <w:spacing w:line="360" w:lineRule="auto"/>
+        <w:ind w:firstLine="480" w:firstLineChars="200"/>
         <w:jc w:val="both"/>
       </w:pPr>
       <w:r>
+        <w:rPr>
+          <w:rFonts w:ascii="Times New Roman" w:hAnsi="Times New Roman" w:eastAsia="宋体" w:cs="Times New Roman"/>
+          <w:b w:val="0"/>
+          <w:color w:val="000000"/>
+          <w:sz w:val="24"/>
+        </w:rPr>
         <w:t>本章完成基于世界模型的机器人抓取搬运系统详细设计。系统以行为克隆提供候选，通过动作条件世界模型预测未来状态并评价动作后果，结合真实D2队列实现逐步闭环，由独立恢复监督器处理失持和停滞。数据设计明确示范、分支、检查点和运行记录的关联，模块接口限定输入语义及调用顺序，为后续系统实现与实验测试提供依据。当前设计面向低维特权状态仿真，世界模型与恢复模块的性能作用以各自的同批对照结果为依据。</w:t>
       </w:r>
     </w:p>
     <w:p>
       <w:pPr>
         <w:pStyle w:val="Heading1"/>
+        <w:ind w:firstLineChars="0" w:firstLine="0"/>
         <w:jc w:val="center"/>
       </w:pPr>
       <w:r>
@@ -6812,6 +7463,7 @@
     <w:p>
       <w:pPr>
         <w:pStyle w:val="ReferenceDesign"/>
+        <w:ind/>
         <w:jc w:val="left"/>
       </w:pPr>
       <w:r>
@@ -6821,6 +7473,7 @@
     <w:p>
       <w:pPr>
         <w:pStyle w:val="ReferenceDesign"/>
+        <w:ind/>
         <w:jc w:val="left"/>
       </w:pPr>
       <w:r>
@@ -6830,6 +7483,7 @@
     <w:p>
       <w:pPr>
         <w:pStyle w:val="ReferenceDesign"/>
+        <w:ind/>
         <w:jc w:val="left"/>
       </w:pPr>
       <w:r>
@@ -6839,6 +7493,7 @@
     <w:p>
       <w:pPr>
         <w:pStyle w:val="ReferenceDesign"/>
+        <w:ind/>
         <w:jc w:val="left"/>
       </w:pPr>
       <w:r>
@@ -6848,6 +7503,7 @@
     <w:p>
       <w:pPr>
         <w:pStyle w:val="ReferenceDesign"/>
+        <w:ind/>
         <w:jc w:val="left"/>
       </w:pPr>
       <w:r>
@@ -6857,6 +7513,7 @@
     <w:p>
       <w:pPr>
         <w:pStyle w:val="ReferenceDesign"/>
+        <w:ind/>
         <w:jc w:val="left"/>
       </w:pPr>
       <w:r>
@@ -6880,7 +7537,7 @@
   <w:p>
     <w:pPr>
       <w:pStyle w:val="Footer"/>
-      <w:ind w:firstLine="0"/>
+      <w:ind w:firstLine="0" w:firstLineChars="0"/>
       <w:jc w:val="center"/>
     </w:pPr>
     <w:r>
@@ -6899,7 +7556,7 @@
   <w:p>
     <w:pPr>
       <w:pStyle w:val="Header"/>
-      <w:ind w:firstLine="0"/>
+      <w:ind w:firstLine="0" w:firstLineChars="0"/>
       <w:jc w:val="right"/>
     </w:pPr>
     <w:r>
@@ -7279,7 +7936,7 @@
     <w:pPr>
       <w:widowControl/>
       <w:spacing w:line="360" w:lineRule="auto" w:after="60"/>
-      <w:ind w:firstLine="480"/>
+      <w:ind w:firstLine="480" w:firstLineChars="200"/>
     </w:pPr>
     <w:rPr>
       <w:rFonts w:ascii="Times New Roman" w:hAnsi="Times New Roman" w:eastAsia="宋体" w:cs="Times New Roman"/>
@@ -7344,14 +8001,17 @@
       <w:keepNext/>
       <w:keepLines/>
       <w:pageBreakBefore w:val="0"/>
-      <w:spacing w:before="120" w:after="200" w:line="300" w:lineRule="auto"/>
-      <w:ind w:firstLine="0"/>
+      <w:spacing w:line="360" w:lineRule="auto" w:beforeLines="100" w:afterLines="100"/>
+      <w:ind w:firstLine="0" w:firstLineChars="0"/>
+      <w:jc w:val="center"/>
       <w:outlineLvl w:val="0"/>
     </w:pPr>
     <w:rPr>
-      <w:rFonts w:ascii="Times New Roman" w:hAnsi="Times New Roman" w:eastAsia="黑体" w:cs="Times New Roman"/>
-      <w:b/>
+      <w:rFonts w:ascii="黑体" w:hAnsi="黑体" w:eastAsia="黑体" w:cs="黑体"/>
+      <w:b w:val="0"/>
       <w:bCs/>
+      <w:i w:val="0"/>
+      <w:iCs w:val="0"/>
       <w:color w:val="000000"/>
       <w:sz w:val="32"/>
       <w:szCs w:val="28"/>
@@ -7369,14 +8029,16 @@
     <w:pPr>
       <w:keepNext/>
       <w:keepLines/>
-      <w:spacing w:before="280" w:after="200" w:line="300" w:lineRule="auto"/>
-      <w:ind w:firstLine="0"/>
+      <w:spacing w:before="280" w:after="200" w:line="360" w:lineRule="auto"/>
+      <w:ind w:firstLine="0" w:firstLineChars="0"/>
       <w:outlineLvl w:val="1"/>
     </w:pPr>
     <w:rPr>
-      <w:rFonts w:ascii="Times New Roman" w:hAnsi="Times New Roman" w:eastAsia="黑体" w:cs="Times New Roman"/>
-      <w:b/>
+      <w:rFonts w:ascii="黑体" w:hAnsi="黑体" w:eastAsia="黑体" w:cs="黑体"/>
+      <w:b w:val="0"/>
       <w:bCs/>
+      <w:i w:val="0"/>
+      <w:iCs w:val="0"/>
       <w:color w:val="000000"/>
       <w:sz w:val="28"/>
       <w:szCs w:val="26"/>
@@ -7394,14 +8056,16 @@
     <w:pPr>
       <w:keepNext/>
       <w:keepLines/>
-      <w:spacing w:before="280" w:after="200" w:line="300" w:lineRule="auto"/>
-      <w:ind w:firstLine="0"/>
+      <w:spacing w:before="280" w:after="200" w:line="360" w:lineRule="auto"/>
+      <w:ind w:firstLine="0" w:firstLineChars="0"/>
       <w:outlineLvl w:val="2"/>
     </w:pPr>
     <w:rPr>
-      <w:rFonts w:ascii="Times New Roman" w:hAnsi="Times New Roman" w:eastAsia="黑体" w:cs="Times New Roman"/>
-      <w:b/>
+      <w:rFonts w:ascii="Times New Roman" w:hAnsi="Times New Roman" w:eastAsia="宋体" w:cs="Times New Roman"/>
+      <w:b w:val="0"/>
       <w:bCs/>
+      <w:i w:val="0"/>
+      <w:iCs w:val="0"/>
       <w:color w:val="000000"/>
       <w:sz w:val="24"/>
     </w:rPr>
@@ -7419,16 +8083,18 @@
     <w:pPr>
       <w:keepNext/>
       <w:keepLines/>
-      <w:spacing w:before="200" w:after="0"/>
+      <w:spacing w:before="200" w:after="0" w:line="360" w:lineRule="auto"/>
+      <w:ind w:firstLine="0" w:firstLineChars="0"/>
       <w:outlineLvl w:val="3"/>
     </w:pPr>
     <w:rPr>
-      <w:rFonts w:asciiTheme="majorHAnsi" w:eastAsiaTheme="majorEastAsia" w:hAnsiTheme="majorHAnsi" w:cstheme="majorBidi"/>
-      <w:b/>
+      <w:rFonts w:ascii="Times New Roman" w:hAnsi="Times New Roman" w:eastAsia="宋体" w:cs="Times New Roman"/>
+      <w:b w:val="0"/>
       <w:bCs/>
-      <w:i/>
-      <w:iCs/>
-      <w:color w:val="4F81BD" w:themeColor="accent1"/>
+      <w:i w:val="0"/>
+      <w:iCs w:val="0"/>
+      <w:color w:val="000000"/>
+      <w:sz w:val="24"/>
     </w:rPr>
   </w:style>
   <w:style w:type="paragraph" w:styleId="Heading5">
@@ -7635,20 +8301,17 @@
     <w:rsid w:val="00FC693F"/>
     <w:pPr>
       <w:keepNext/>
-      <w:pBdr>
-        <w:bottom w:val="single" w:sz="8" w:space="4" w:color="4F81BD" w:themeColor="accent1"/>
-      </w:pBdr>
       <w:spacing w:after="200" w:line="300" w:lineRule="auto" w:before="280"/>
-      <w:ind w:firstLine="0"/>
+      <w:ind w:firstLine="0" w:firstLineChars="0"/>
       <w:contextualSpacing/>
     </w:pPr>
     <w:rPr>
       <w:rFonts w:ascii="Times New Roman" w:hAnsi="Times New Roman" w:eastAsia="黑体" w:cs="Times New Roman"/>
-      <w:b/>
+      <w:b w:val="0"/>
       <w:color w:val="000000"/>
       <w:spacing w:val="5"/>
       <w:kern w:val="28"/>
-      <w:sz w:val="36"/>
+      <w:sz w:val="32"/>
       <w:szCs w:val="52"/>
     </w:rPr>
   </w:style>
@@ -8090,6 +8753,7 @@
     <w:rsid w:val="00FC693F"/>
     <w:pPr>
       <w:spacing w:line="240" w:lineRule="auto"/>
+      <w:ind w:firstLine="0" w:firstLineChars="0"/>
     </w:pPr>
     <w:rPr>
       <w:rFonts w:ascii="Times New Roman" w:hAnsi="Times New Roman" w:eastAsia="宋体" w:cs="Times New Roman"/>
@@ -19044,7 +19708,7 @@
         <w:tab w:pos="9071" w:val="right"/>
       </w:tabs>
       <w:spacing w:after="180" w:before="160" w:line="288" w:lineRule="auto"/>
-      <w:ind w:firstLine="0"/>
+      <w:ind w:firstLine="0" w:firstLineChars="0"/>
     </w:pPr>
     <w:rPr>
       <w:rFonts w:ascii="Cambria Math" w:hAnsi="Cambria Math" w:eastAsia="宋体" w:cs="Cambria Math"/>
@@ -19057,7 +19721,7 @@
     <w:name w:val="Reference Design"/>
     <w:pPr>
       <w:spacing w:line="300" w:lineRule="auto" w:after="160"/>
-      <w:ind w:hanging="369" w:left="369"/>
+      <w:ind w:left="369" w:hanging="369"/>
     </w:pPr>
     <w:rPr>
       <w:rFonts w:ascii="Times New Roman" w:hAnsi="Times New Roman" w:eastAsia="宋体" w:cs="Times New Roman"/>

</xml_diff>